<commit_message>
fix(novice): overhaul v2 — point de départ vécu, mots simples, progression justifiée
- chaque section s'ouvre sur « Pourquoi cette section ? » : la progression
  est motivée, pas subie ; chaque section referme sur la question suivante
- chaque terme technique expliqué entre parenthèses à sa première apparition
  (octet, paquet, discipline de file, contrôle de congestion, netem, CSV,
  manifeste, SHA-256, médiane, p95, QDI...)
- point de départ honnête : le pays qui paie sa connexion au détail, le prix
  AVANT la technique, ARTEC 2025 en contexte
- métaphore péage prolongée : guichet sans agent / agent vigilant / agent
  complet ; écolier qui se cogne / qui mesure d'abord
- prose découpée : plus aucun bloc de prose > 70 mots, exemples multi-parties
  segmentés visuellement
- L1 reconstruit et vérifié : le chapitre 8 QA (25 questions armées) est bien
  présent dans livrable1-explication.docx (13 pages, 4 692 mots)
</commit_message>
<xml_diff>
--- a/book/livrable1-novice.docx
+++ b/book/livrable1-novice.docx
@@ -19,130 +19,98 @@
     </w:p>
     <w:p>
       <w:pPr>
-        <w:spacing w:after="120" w:before="0" w:line="360"/>
-        <w:jc w:val="both"/>
-      </w:pPr>
-      <w:r>
-        <w:rPr>
-          <w:rFonts w:ascii="Times New Roman" w:cs="Times New Roman" w:eastAsia="Times New Roman" w:hAnsi="Times New Roman"/>
-          <w:b w:val="false"/>
-          <w:bCs w:val="false"/>
-          <w:i w:val="false"/>
-          <w:iCs w:val="false"/>
-          <w:sz w:val="24"/>
-          <w:szCs w:val="24"/>
-        </w:rPr>
-        <w:t xml:space="preserve">Ce document se lit en une soirée, avec un café. Il t'apprend ce que dit le mémoire, pourquoi ça compte, et comment utiliser l'outil. Lis-le </w:t>
-      </w:r>
-      <w:r>
-        <w:rPr>
-          <w:rFonts w:ascii="Times New Roman" w:cs="Times New Roman" w:eastAsia="Times New Roman" w:hAnsi="Times New Roman"/>
-          <w:b/>
-          <w:bCs/>
-          <w:i w:val="false"/>
-          <w:iCs w:val="false"/>
-          <w:sz w:val="24"/>
-          <w:szCs w:val="24"/>
-        </w:rPr>
-        <w:t xml:space="preserve">avant tout le reste</w:t>
-      </w:r>
-      <w:r>
-        <w:rPr>
-          <w:rFonts w:ascii="Times New Roman" w:cs="Times New Roman" w:eastAsia="Times New Roman" w:hAnsi="Times New Roman"/>
-          <w:b w:val="false"/>
-          <w:bCs w:val="false"/>
-          <w:i w:val="false"/>
-          <w:iCs w:val="false"/>
-          <w:sz w:val="24"/>
-          <w:szCs w:val="24"/>
-        </w:rPr>
-        <w:t xml:space="preserve"> : ensuite, le document d'explication complet prépare ton oral, et la thèse creuse chaque point.</w:t>
-      </w:r>
-    </w:p>
-    <w:p>
-      <w:pPr>
-        <w:spacing w:after="120" w:before="0" w:line="360"/>
-        <w:jc w:val="both"/>
-      </w:pPr>
-      <w:r>
-        <w:rPr>
-          <w:rFonts w:ascii="Times New Roman" w:cs="Times New Roman" w:eastAsia="Times New Roman" w:hAnsi="Times New Roman"/>
-          <w:b w:val="false"/>
-          <w:bCs w:val="false"/>
-          <w:i w:val="false"/>
-          <w:iCs w:val="false"/>
-          <w:sz w:val="24"/>
-          <w:szCs w:val="24"/>
-        </w:rPr>
-        <w:t xml:space="preserve">Une règle de lecture : chaque terme technique est </w:t>
-      </w:r>
-      <w:r>
-        <w:rPr>
-          <w:rFonts w:ascii="Times New Roman" w:cs="Times New Roman" w:eastAsia="Times New Roman" w:hAnsi="Times New Roman"/>
-          <w:b/>
-          <w:bCs/>
-          <w:i w:val="false"/>
-          <w:iCs w:val="false"/>
-          <w:sz w:val="24"/>
-          <w:szCs w:val="24"/>
-        </w:rPr>
-        <w:t xml:space="preserve">en gras à sa première apparition</w:t>
-      </w:r>
-      <w:r>
-        <w:rPr>
-          <w:rFonts w:ascii="Times New Roman" w:cs="Times New Roman" w:eastAsia="Times New Roman" w:hAnsi="Times New Roman"/>
-          <w:b w:val="false"/>
-          <w:bCs w:val="false"/>
-          <w:i w:val="false"/>
-          <w:iCs w:val="false"/>
-          <w:sz w:val="24"/>
-          <w:szCs w:val="24"/>
-        </w:rPr>
-        <w:t xml:space="preserve">, et défini juste avant d'être utilisé. Les phrases en </w:t>
-      </w:r>
-      <w:r>
-        <w:rPr>
-          <w:rFonts w:ascii="Times New Roman" w:cs="Times New Roman" w:eastAsia="Times New Roman" w:hAnsi="Times New Roman"/>
-          <w:b w:val="false"/>
-          <w:bCs w:val="false"/>
+        <w:spacing w:after="140" w:before="0" w:line="360"/>
+        <w:jc w:val="both"/>
+      </w:pPr>
+      <w:r>
+        <w:rPr>
+          <w:rFonts w:ascii="Times New Roman" w:cs="Times New Roman" w:eastAsia="Times New Roman" w:hAnsi="Times New Roman"/>
+          <w:b w:val="false"/>
+          <w:bCs w:val="false"/>
+          <w:i w:val="false"/>
+          <w:iCs w:val="false"/>
+          <w:sz w:val="24"/>
+          <w:szCs w:val="24"/>
+        </w:rPr>
+        <w:t xml:space="preserve">Tu n'as pas lu la thèse. Normal : elle fait quatre-vingts pages. Ce document la remplace pour ce soir. Tu y trouveras </w:t>
+      </w:r>
+      <w:r>
+        <w:rPr>
+          <w:rFonts w:ascii="Times New Roman" w:cs="Times New Roman" w:eastAsia="Times New Roman" w:hAnsi="Times New Roman"/>
+          <w:b/>
+          <w:bCs/>
+          <w:i w:val="false"/>
+          <w:iCs w:val="false"/>
+          <w:sz w:val="24"/>
+          <w:szCs w:val="24"/>
+        </w:rPr>
+        <w:t xml:space="preserve">ce qui se passe, pourquoi ça se passe, comment ça se passe</w:t>
+      </w:r>
+      <w:r>
+        <w:rPr>
+          <w:rFonts w:ascii="Times New Roman" w:cs="Times New Roman" w:eastAsia="Times New Roman" w:hAnsi="Times New Roman"/>
+          <w:b w:val="false"/>
+          <w:bCs w:val="false"/>
+          <w:i w:val="false"/>
+          <w:iCs w:val="false"/>
+          <w:sz w:val="24"/>
+          <w:szCs w:val="24"/>
+        </w:rPr>
+        <w:t xml:space="preserve">, et comment te servir de l'outil. Une seule règle : chaque mot technique est expliqué entre parenthèses, juste au moment où il apparaît. Tu n'as rien à savoir d'avance.</w:t>
+      </w:r>
+    </w:p>
+    <w:p>
+      <w:pPr>
+        <w:spacing w:after="140" w:before="0" w:line="360"/>
+        <w:jc w:val="both"/>
+      </w:pPr>
+      <w:r>
+        <w:rPr>
+          <w:rFonts w:ascii="Times New Roman" w:cs="Times New Roman" w:eastAsia="Times New Roman" w:hAnsi="Times New Roman"/>
+          <w:b w:val="false"/>
+          <w:bCs w:val="false"/>
+          <w:i w:val="false"/>
+          <w:iCs w:val="false"/>
+          <w:sz w:val="24"/>
+          <w:szCs w:val="24"/>
+        </w:rPr>
+        <w:t xml:space="preserve">Lis dans l'ordre : chaque section répond à la question laissée ouverte par la précédente. Si tu comprends une section, la suivante s'ouvre. À la fin, les cinq chiffres à retenir referment le tout.</w:t>
+      </w:r>
+    </w:p>
+    <w:p>
+      <w:pPr>
+        <w:spacing w:after="200" w:before="360" w:line="360"/>
+      </w:pPr>
+      <w:r>
+        <w:rPr>
+          <w:rFonts w:ascii="Times New Roman" w:cs="Times New Roman" w:eastAsia="Times New Roman" w:hAnsi="Times New Roman"/>
+          <w:b/>
+          <w:bCs/>
+          <w:sz w:val="32"/>
+          <w:szCs w:val="32"/>
+        </w:rPr>
+        <w:t xml:space="preserve">1. Le point de départ : un pays qui paie sa connexion au détail</w:t>
+      </w:r>
+    </w:p>
+    <w:p>
+      <w:pPr>
+        <w:spacing w:after="160" w:line="340"/>
+        <w:ind w:left="454"/>
+      </w:pPr>
+      <w:r>
+        <w:rPr>
+          <w:rFonts w:ascii="Times New Roman" w:cs="Times New Roman" w:eastAsia="Times New Roman" w:hAnsi="Times New Roman"/>
           <w:i/>
           <w:iCs/>
-          <w:sz w:val="24"/>
-          <w:szCs w:val="24"/>
-        </w:rPr>
-        <w:t xml:space="preserve">italique</w:t>
-      </w:r>
-      <w:r>
-        <w:rPr>
-          <w:rFonts w:ascii="Times New Roman" w:cs="Times New Roman" w:eastAsia="Times New Roman" w:hAnsi="Times New Roman"/>
-          <w:b w:val="false"/>
-          <w:bCs w:val="false"/>
-          <w:i w:val="false"/>
-          <w:iCs w:val="false"/>
-          <w:sz w:val="24"/>
-          <w:szCs w:val="24"/>
-        </w:rPr>
-        <w:t xml:space="preserve"> font le lien entre deux idées : elles relient ce que tu viens d'apprendre à ce qui arrive.</w:t>
-      </w:r>
-    </w:p>
-    <w:p>
-      <w:pPr>
-        <w:spacing w:after="200" w:before="360" w:line="360"/>
-      </w:pPr>
-      <w:r>
-        <w:rPr>
-          <w:rFonts w:ascii="Times New Roman" w:cs="Times New Roman" w:eastAsia="Times New Roman" w:hAnsi="Times New Roman"/>
-          <w:b/>
-          <w:bCs/>
-          <w:sz w:val="32"/>
-          <w:szCs w:val="32"/>
-        </w:rPr>
-        <w:t xml:space="preserve">1. Pourquoi ce mémoire existe</w:t>
-      </w:r>
-    </w:p>
-    <w:p>
-      <w:pPr>
-        <w:spacing w:after="120" w:before="0" w:line="360"/>
+          <w:sz w:val="23"/>
+          <w:szCs w:val="23"/>
+        </w:rPr>
+        <w:t xml:space="preserve">Pourquoi commencer ici ? Parce que tout le mémoire découle de cette situation. Sans elle, le sujet n'existe pas.</w:t>
+      </w:r>
+    </w:p>
+    <w:p>
+      <w:pPr>
+        <w:spacing w:after="140" w:before="0" w:line="360"/>
         <w:ind w:firstLine="709"/>
         <w:jc w:val="both"/>
       </w:pPr>
@@ -168,177 +136,26 @@
           <w:sz w:val="24"/>
           <w:szCs w:val="24"/>
         </w:rPr>
-        <w:t xml:space="preserve"> protège la population : prévoir les cyclones, alerter à temps. Pour ça, ses stations envoient des relevés, ses équipes consultent des tableaux de bord, ses serveurs téléchargent des images satellite. Tout ce trafic passe par Internet.</w:t>
-      </w:r>
-    </w:p>
-    <w:p>
-      <w:pPr>
-        <w:spacing w:after="120" w:before="0" w:line="360"/>
+        <w:t xml:space="preserve"> (l'organisme public qui prévoit la météo et lance les alertes cyclones) fait un travail simple à décrire : ses stations automatiques envoient des mesures, ses équipes regardent des tableaux de bord, ses serveurs téléchargent des images satellite. Tout cela voyage sur Internet.</w:t>
+      </w:r>
+    </w:p>
+    <w:p>
+      <w:pPr>
+        <w:spacing w:after="140" w:before="0" w:line="360"/>
         <w:ind w:firstLine="709"/>
         <w:jc w:val="both"/>
       </w:pPr>
       <w:r>
         <w:rPr>
           <w:rFonts w:ascii="Times New Roman" w:cs="Times New Roman" w:eastAsia="Times New Roman" w:hAnsi="Times New Roman"/>
-          <w:b/>
-          <w:bCs/>
-          <w:i w:val="false"/>
-          <w:iCs w:val="false"/>
-          <w:sz w:val="24"/>
-          <w:szCs w:val="24"/>
-        </w:rPr>
-        <w:t xml:space="preserve">Les quatre classes de liens</w:t>
-      </w:r>
-      <w:r>
-        <w:rPr>
-          <w:rFonts w:ascii="Times New Roman" w:cs="Times New Roman" w:eastAsia="Times New Roman" w:hAnsi="Times New Roman"/>
-          <w:b w:val="false"/>
-          <w:bCs w:val="false"/>
-          <w:i w:val="false"/>
-          <w:iCs w:val="false"/>
-          <w:sz w:val="24"/>
-          <w:szCs w:val="24"/>
-        </w:rPr>
-        <w:t xml:space="preserve"> de l'institution ne se valent pas. Le siège d'Antananarivo a la </w:t>
-      </w:r>
-      <w:r>
-        <w:rPr>
-          <w:rFonts w:ascii="Times New Roman" w:cs="Times New Roman" w:eastAsia="Times New Roman" w:hAnsi="Times New Roman"/>
-          <w:b/>
-          <w:bCs/>
-          <w:i w:val="false"/>
-          <w:iCs w:val="false"/>
-          <w:sz w:val="24"/>
-          <w:szCs w:val="24"/>
-        </w:rPr>
-        <w:t xml:space="preserve">fibre optique</w:t>
-      </w:r>
-      <w:r>
-        <w:rPr>
-          <w:rFonts w:ascii="Times New Roman" w:cs="Times New Roman" w:eastAsia="Times New Roman" w:hAnsi="Times New Roman"/>
-          <w:b w:val="false"/>
-          <w:bCs w:val="false"/>
-          <w:i w:val="false"/>
-          <w:iCs w:val="false"/>
-          <w:sz w:val="24"/>
-          <w:szCs w:val="24"/>
-        </w:rPr>
-        <w:t xml:space="preserve">, rapide. Les directions régionales ont la </w:t>
-      </w:r>
-      <w:r>
-        <w:rPr>
-          <w:rFonts w:ascii="Times New Roman" w:cs="Times New Roman" w:eastAsia="Times New Roman" w:hAnsi="Times New Roman"/>
-          <w:b/>
-          <w:bCs/>
-          <w:i w:val="false"/>
-          <w:iCs w:val="false"/>
-          <w:sz w:val="24"/>
-          <w:szCs w:val="24"/>
-        </w:rPr>
-        <w:t xml:space="preserve">4G</w:t>
-      </w:r>
-      <w:r>
-        <w:rPr>
-          <w:rFonts w:ascii="Times New Roman" w:cs="Times New Roman" w:eastAsia="Times New Roman" w:hAnsi="Times New Roman"/>
-          <w:b w:val="false"/>
-          <w:bCs w:val="false"/>
-          <w:i w:val="false"/>
-          <w:iCs w:val="false"/>
-          <w:sz w:val="24"/>
-          <w:szCs w:val="24"/>
-        </w:rPr>
-        <w:t xml:space="preserve"> de l'opérateur Yas. Les stations isolées dépendent du </w:t>
-      </w:r>
-      <w:r>
-        <w:rPr>
-          <w:rFonts w:ascii="Times New Roman" w:cs="Times New Roman" w:eastAsia="Times New Roman" w:hAnsi="Times New Roman"/>
-          <w:b/>
-          <w:bCs/>
-          <w:i w:val="false"/>
-          <w:iCs w:val="false"/>
-          <w:sz w:val="24"/>
-          <w:szCs w:val="24"/>
-        </w:rPr>
-        <w:t xml:space="preserve">satellite géostationnaire</w:t>
-      </w:r>
-      <w:r>
-        <w:rPr>
-          <w:rFonts w:ascii="Times New Roman" w:cs="Times New Roman" w:eastAsia="Times New Roman" w:hAnsi="Times New Roman"/>
-          <w:b w:val="false"/>
-          <w:bCs w:val="false"/>
-          <w:i w:val="false"/>
-          <w:iCs w:val="false"/>
-          <w:sz w:val="24"/>
-          <w:szCs w:val="24"/>
-        </w:rPr>
-        <w:t xml:space="preserve">, appelé VSAT : lent, six cents millisecondes d'aller-retour. Et récemment, </w:t>
-      </w:r>
-      <w:r>
-        <w:rPr>
-          <w:rFonts w:ascii="Times New Roman" w:cs="Times New Roman" w:eastAsia="Times New Roman" w:hAnsi="Times New Roman"/>
-          <w:b/>
-          <w:bCs/>
-          <w:i w:val="false"/>
-          <w:iCs w:val="false"/>
-          <w:sz w:val="24"/>
-          <w:szCs w:val="24"/>
-        </w:rPr>
-        <w:t xml:space="preserve">Starlink</w:t>
-      </w:r>
-      <w:r>
-        <w:rPr>
-          <w:rFonts w:ascii="Times New Roman" w:cs="Times New Roman" w:eastAsia="Times New Roman" w:hAnsi="Times New Roman"/>
-          <w:b w:val="false"/>
-          <w:bCs w:val="false"/>
-          <w:i w:val="false"/>
-          <w:iCs w:val="false"/>
-          <w:sz w:val="24"/>
-          <w:szCs w:val="24"/>
-        </w:rPr>
-        <w:t xml:space="preserve"> arrive avec ses satellites en orbite basse : quarante millisecondes, mais une facture d'environ 226 000 ariary par mois d'après la presse de 2025.</w:t>
-      </w:r>
-    </w:p>
-    <w:p>
-      <w:pPr>
-        <w:spacing w:after="120" w:before="0" w:line="360"/>
-        <w:ind w:firstLine="709"/>
-        <w:jc w:val="both"/>
-      </w:pPr>
-      <w:r>
-        <w:rPr>
-          <w:rFonts w:ascii="Times New Roman" w:cs="Times New Roman" w:eastAsia="Times New Roman" w:hAnsi="Times New Roman"/>
-          <w:b w:val="false"/>
-          <w:bCs w:val="false"/>
-          <w:i w:val="false"/>
-          <w:iCs w:val="false"/>
-          <w:sz w:val="24"/>
-          <w:szCs w:val="24"/>
-        </w:rPr>
-        <w:t xml:space="preserve">La contrainte la plus forte n'est pas technique : elle est </w:t>
-      </w:r>
-      <w:r>
-        <w:rPr>
-          <w:rFonts w:ascii="Times New Roman" w:cs="Times New Roman" w:eastAsia="Times New Roman" w:hAnsi="Times New Roman"/>
-          <w:b/>
-          <w:bCs/>
-          <w:i w:val="false"/>
-          <w:iCs w:val="false"/>
-          <w:sz w:val="24"/>
-          <w:szCs w:val="24"/>
-        </w:rPr>
-        <w:t xml:space="preserve">économique</w:t>
-      </w:r>
-      <w:r>
-        <w:rPr>
-          <w:rFonts w:ascii="Times New Roman" w:cs="Times New Roman" w:eastAsia="Times New Roman" w:hAnsi="Times New Roman"/>
-          <w:b w:val="false"/>
-          <w:bCs w:val="false"/>
-          <w:i w:val="false"/>
-          <w:iCs w:val="false"/>
-          <w:sz w:val="24"/>
-          <w:szCs w:val="24"/>
-        </w:rPr>
-        <w:t xml:space="preserve">. La connexion se vend prépayée, au volume. Vingt-cinq mille ariary achètent 4,5 gigaoctets pour un mois. Chaque octet gaspillé est un octet payé deux fois.</w:t>
+          <w:b w:val="false"/>
+          <w:bCs w:val="false"/>
+          <w:i w:val="false"/>
+          <w:iCs w:val="false"/>
+          <w:sz w:val="24"/>
+          <w:szCs w:val="24"/>
+        </w:rPr>
+        <w:t xml:space="preserve">Mais tous ses sites n'ont pas le même Internet. Quatre situations existent, du plus rapide au plus lent :</w:t>
       </w:r>
     </w:p>
     <w:p>
@@ -346,7 +163,7 @@
         <w:pBdr>
           <w:left w:val="single" w:color="9DB4CE" w:sz="6"/>
         </w:pBdr>
-        <w:spacing w:after="160" w:before="80" w:line="340"/>
+        <w:spacing w:after="180" w:before="80" w:line="340"/>
         <w:ind w:left="850" w:right="454"/>
         <w:jc w:val="both"/>
       </w:pPr>
@@ -356,24 +173,136 @@
           <w:sz w:val="23"/>
           <w:szCs w:val="23"/>
         </w:rPr>
-        <w:t xml:space="preserve">Le même site régional fait les deux sur le même lien 4G : envoyer une alerte cyclone de quelques octets, et télécharger une image satellite de plusieurs gigaoctets. L'alerte est urgente, l'image est patiente. Sur un lien encombré, l'urgence attend derrière la patience.</w:t>
-      </w:r>
-    </w:p>
-    <w:p>
-      <w:pPr>
-        <w:spacing w:after="200" w:before="160" w:line="360"/>
-        <w:ind w:left="454"/>
-        <w:jc w:val="both"/>
-      </w:pPr>
-      <w:r>
-        <w:rPr>
-          <w:rFonts w:ascii="Times New Roman" w:cs="Times New Roman" w:eastAsia="Times New Roman" w:hAnsi="Times New Roman"/>
-          <w:i/>
-          <w:iCs/>
-          <w:sz w:val="24"/>
-          <w:szCs w:val="24"/>
-        </w:rPr>
-        <w:t xml:space="preserve">Ce partage d'un lien étroit entre trafic urgent et trafic massif pose le problème central : que se passe-t-il exactement quand les deux se rencontrent ? La section suivante le montre.</w:t>
+        <w:t xml:space="preserve">Le siège, à Antananarivo : la fibre (le câble qui va jusqu'au bâtiment, très rapide). Les directions régionales : la 4G (le réseau des téléphones portables, utilisé comme connexion fixe). Les stations isolées : le VSAT (le satellite classique, très loin : un message met 600 millisecondes pour faire l'aller-retour). Et depuis peu : Starlink (des satellites beaucoup plus proches, 40 millisecondes).</w:t>
+      </w:r>
+    </w:p>
+    <w:p>
+      <w:pPr>
+        <w:spacing w:after="140" w:before="0" w:line="360"/>
+        <w:ind w:firstLine="709"/>
+        <w:jc w:val="both"/>
+      </w:pPr>
+      <w:r>
+        <w:rPr>
+          <w:rFonts w:ascii="Times New Roman" w:cs="Times New Roman" w:eastAsia="Times New Roman" w:hAnsi="Times New Roman"/>
+          <w:b w:val="false"/>
+          <w:bCs w:val="false"/>
+          <w:i w:val="false"/>
+          <w:iCs w:val="false"/>
+          <w:sz w:val="24"/>
+          <w:szCs w:val="24"/>
+        </w:rPr>
+        <w:t xml:space="preserve">La contrainte qui change tout n'est pas la vitesse. C'est le </w:t>
+      </w:r>
+      <w:r>
+        <w:rPr>
+          <w:rFonts w:ascii="Times New Roman" w:cs="Times New Roman" w:eastAsia="Times New Roman" w:hAnsi="Times New Roman"/>
+          <w:b/>
+          <w:bCs/>
+          <w:i w:val="false"/>
+          <w:iCs w:val="false"/>
+          <w:sz w:val="24"/>
+          <w:szCs w:val="24"/>
+        </w:rPr>
+        <w:t xml:space="preserve">prix</w:t>
+      </w:r>
+      <w:r>
+        <w:rPr>
+          <w:rFonts w:ascii="Times New Roman" w:cs="Times New Roman" w:eastAsia="Times New Roman" w:hAnsi="Times New Roman"/>
+          <w:b w:val="false"/>
+          <w:bCs w:val="false"/>
+          <w:i w:val="false"/>
+          <w:iCs w:val="false"/>
+          <w:sz w:val="24"/>
+          <w:szCs w:val="24"/>
+        </w:rPr>
+        <w:t xml:space="preserve">. La 4G se vend prépayée, au volume : </w:t>
+      </w:r>
+      <w:r>
+        <w:rPr>
+          <w:rFonts w:ascii="Times New Roman" w:cs="Times New Roman" w:eastAsia="Times New Roman" w:hAnsi="Times New Roman"/>
+          <w:b/>
+          <w:bCs/>
+          <w:i w:val="false"/>
+          <w:iCs w:val="false"/>
+          <w:sz w:val="24"/>
+          <w:szCs w:val="24"/>
+        </w:rPr>
+        <w:t xml:space="preserve">25 000 ariary achètent 4,5 gigaoctets pour un mois</w:t>
+      </w:r>
+      <w:r>
+        <w:rPr>
+          <w:rFonts w:ascii="Times New Roman" w:cs="Times New Roman" w:eastAsia="Times New Roman" w:hAnsi="Times New Roman"/>
+          <w:b w:val="false"/>
+          <w:bCs w:val="false"/>
+          <w:i w:val="false"/>
+          <w:iCs w:val="false"/>
+          <w:sz w:val="24"/>
+          <w:szCs w:val="24"/>
+        </w:rPr>
+        <w:t xml:space="preserve">. Le gigaoctet coûte donc 5 556 ariary à ce palier, le plus mauvais rapport du catalogue : le forfait journalier, 1 000 ariary pour 1 gigaoctet, est cinq fois moins cher au gigaoctet.</w:t>
+      </w:r>
+    </w:p>
+    <w:p>
+      <w:pPr>
+        <w:spacing w:after="140" w:before="0" w:line="360"/>
+        <w:ind w:firstLine="709"/>
+        <w:jc w:val="both"/>
+      </w:pPr>
+      <w:r>
+        <w:rPr>
+          <w:rFonts w:ascii="Times New Roman" w:cs="Times New Roman" w:eastAsia="Times New Roman" w:hAnsi="Times New Roman"/>
+          <w:b w:val="false"/>
+          <w:bCs w:val="false"/>
+          <w:i w:val="false"/>
+          <w:iCs w:val="false"/>
+          <w:sz w:val="24"/>
+          <w:szCs w:val="24"/>
+        </w:rPr>
+        <w:t xml:space="preserve">En octobre 2025, le régulateur ARTEC (l'autorité qui surveille les télécoms malgaches) a convoqué les trois opérateurs sur le prix de la donnée : le sujet est sur la place publique.</w:t>
+      </w:r>
+    </w:p>
+    <w:p>
+      <w:pPr>
+        <w:spacing w:after="140" w:before="0" w:line="360"/>
+        <w:ind w:firstLine="709"/>
+        <w:jc w:val="both"/>
+      </w:pPr>
+      <w:r>
+        <w:rPr>
+          <w:rFonts w:ascii="Times New Roman" w:cs="Times New Roman" w:eastAsia="Times New Roman" w:hAnsi="Times New Roman"/>
+          <w:b w:val="false"/>
+          <w:bCs w:val="false"/>
+          <w:i w:val="false"/>
+          <w:iCs w:val="false"/>
+          <w:sz w:val="24"/>
+          <w:szCs w:val="24"/>
+        </w:rPr>
+        <w:t xml:space="preserve">Conséquence directe : </w:t>
+      </w:r>
+      <w:r>
+        <w:rPr>
+          <w:rFonts w:ascii="Times New Roman" w:cs="Times New Roman" w:eastAsia="Times New Roman" w:hAnsi="Times New Roman"/>
+          <w:b/>
+          <w:bCs/>
+          <w:i w:val="false"/>
+          <w:iCs w:val="false"/>
+          <w:sz w:val="24"/>
+          <w:szCs w:val="24"/>
+        </w:rPr>
+        <w:t xml:space="preserve">chaque octet (petite unité de données, il en faut un milliard pour un gigaoctet) qui voyage deux fois est payé deux fois</w:t>
+      </w:r>
+      <w:r>
+        <w:rPr>
+          <w:rFonts w:ascii="Times New Roman" w:cs="Times New Roman" w:eastAsia="Times New Roman" w:hAnsi="Times New Roman"/>
+          <w:b w:val="false"/>
+          <w:bCs w:val="false"/>
+          <w:i w:val="false"/>
+          <w:iCs w:val="false"/>
+          <w:sz w:val="24"/>
+          <w:szCs w:val="24"/>
+        </w:rPr>
+        <w:t xml:space="preserve">. Et un réseau encombré fait justement voyager les données plusieurs fois : quand un paquet (un morceau de données) arrive dans une file trop pleine, il est jeté, puis renvoyé. Tu paies le renvoi.</w:t>
       </w:r>
     </w:p>
     <w:p>
@@ -435,7 +364,23 @@
           <w:sz w:val="22"/>
           <w:szCs w:val="22"/>
         </w:rPr>
-        <w:t xml:space="preserve">Le prix du gigaoctet selon le forfait, opérateur principal, 2026 : le mensuel de référence est le plus cher, cinq fois le journalier.</w:t>
+        <w:t xml:space="preserve">Le prix du gigaoctet selon le forfait, opérateur principal, 2026. Le mensuel de référence est le plus cher : cinq fois le journalier.</w:t>
+      </w:r>
+    </w:p>
+    <w:p>
+      <w:pPr>
+        <w:spacing w:after="160" w:line="340"/>
+        <w:ind w:left="454"/>
+      </w:pPr>
+      <w:r>
+        <w:rPr>
+          <w:rFonts w:ascii="Times New Roman" w:cs="Times New Roman" w:eastAsia="Times New Roman" w:hAnsi="Times New Roman"/>
+          <w:i/>
+          <w:iCs/>
+          <w:sz w:val="23"/>
+          <w:szCs w:val="23"/>
+        </w:rPr>
+        <w:t xml:space="preserve">Voilà le terrain. La question suivante s'impose d'elle-même : que fait cette congestion aux messages urgents ? C'est la section 2.</w:t>
       </w:r>
     </w:p>
     <w:p>
@@ -450,12 +395,28 @@
           <w:sz w:val="32"/>
           <w:szCs w:val="32"/>
         </w:rPr>
-        <w:t xml:space="preserve">2. Le problème : le péage embouteillé</w:t>
-      </w:r>
-    </w:p>
-    <w:p>
-      <w:pPr>
-        <w:spacing w:after="120" w:before="0" w:line="360"/>
+        <w:t xml:space="preserve">2. Le problème : le petit message pris dans la file</w:t>
+      </w:r>
+    </w:p>
+    <w:p>
+      <w:pPr>
+        <w:spacing w:after="160" w:line="340"/>
+        <w:ind w:left="454"/>
+      </w:pPr>
+      <w:r>
+        <w:rPr>
+          <w:rFonts w:ascii="Times New Roman" w:cs="Times New Roman" w:eastAsia="Times New Roman" w:hAnsi="Times New Roman"/>
+          <w:i/>
+          <w:iCs/>
+          <w:sz w:val="23"/>
+          <w:szCs w:val="23"/>
+        </w:rPr>
+        <w:t xml:space="preserve">Pourquoi cette section ? Parce qu'il faut voir le problème de ses propres yeux avant d'entendre son nom savant.</w:t>
+      </w:r>
+    </w:p>
+    <w:p>
+      <w:pPr>
+        <w:spacing w:after="140" w:before="0" w:line="360"/>
         <w:ind w:firstLine="709"/>
         <w:jc w:val="both"/>
       </w:pPr>
@@ -469,36 +430,36 @@
           <w:sz w:val="24"/>
           <w:szCs w:val="24"/>
         </w:rPr>
-        <w:t xml:space="preserve">Imagine une autoroute avec un seul </w:t>
-      </w:r>
-      <w:r>
-        <w:rPr>
-          <w:rFonts w:ascii="Times New Roman" w:cs="Times New Roman" w:eastAsia="Times New Roman" w:hAnsi="Times New Roman"/>
-          <w:b/>
-          <w:bCs/>
-          <w:i w:val="false"/>
-          <w:iCs w:val="false"/>
-          <w:sz w:val="24"/>
-          <w:szCs w:val="24"/>
-        </w:rPr>
-        <w:t xml:space="preserve">péage</w:t>
-      </w:r>
-      <w:r>
-        <w:rPr>
-          <w:rFonts w:ascii="Times New Roman" w:cs="Times New Roman" w:eastAsia="Times New Roman" w:hAnsi="Times New Roman"/>
-          <w:b w:val="false"/>
-          <w:bCs w:val="false"/>
-          <w:i w:val="false"/>
-          <w:iCs w:val="false"/>
-          <w:sz w:val="24"/>
-          <w:szCs w:val="24"/>
-        </w:rPr>
-        <w:t xml:space="preserve">. Tant que le trafic est léger, tout passe vite. Quand un convoi de camions arrive, la file s'allonge devant le péage. La petite voiture arrivée derrière attend autant que les camions, alors qu'elle seule mettrait une seconde à passer.</w:t>
-      </w:r>
-    </w:p>
-    <w:p>
-      <w:pPr>
-        <w:spacing w:after="120" w:before="0" w:line="360"/>
+        <w:t xml:space="preserve">Imagine un péage d'autoroute. Un seul guichet. Un jour, un convoi de cent camions arrive : la file d'attente devant le guichet s'allonge. Une voiture arrive derrière : elle aussi attend. </w:t>
+      </w:r>
+      <w:r>
+        <w:rPr>
+          <w:rFonts w:ascii="Times New Roman" w:cs="Times New Roman" w:eastAsia="Times New Roman" w:hAnsi="Times New Roman"/>
+          <w:b/>
+          <w:bCs/>
+          <w:i w:val="false"/>
+          <w:iCs w:val="false"/>
+          <w:sz w:val="24"/>
+          <w:szCs w:val="24"/>
+        </w:rPr>
+        <w:t xml:space="preserve">Pourtant le guichet n'est pas en panne : il traite les véhicules à la même vitesse qu'avant.</w:t>
+      </w:r>
+      <w:r>
+        <w:rPr>
+          <w:rFonts w:ascii="Times New Roman" w:cs="Times New Roman" w:eastAsia="Times New Roman" w:hAnsi="Times New Roman"/>
+          <w:b w:val="false"/>
+          <w:bCs w:val="false"/>
+          <w:i w:val="false"/>
+          <w:iCs w:val="false"/>
+          <w:sz w:val="24"/>
+          <w:szCs w:val="24"/>
+        </w:rPr>
+        <w:t xml:space="preserve"> Le problème n'est pas la vitesse du guichet, c'est la file.</w:t>
+      </w:r>
+    </w:p>
+    <w:p>
+      <w:pPr>
+        <w:spacing w:after="140" w:before="0" w:line="360"/>
         <w:ind w:firstLine="709"/>
         <w:jc w:val="both"/>
       </w:pPr>
@@ -512,7 +473,7 @@
           <w:sz w:val="24"/>
           <w:szCs w:val="24"/>
         </w:rPr>
-        <w:t xml:space="preserve">Un lien Internet fonctionne pareil. Chaque équipement réseau garde une </w:t>
+        <w:t xml:space="preserve">Un lien Internet a exactement le même guichet : chaque équipement réseau garde une </w:t>
       </w:r>
       <w:r>
         <w:rPr>
@@ -536,7 +497,26 @@
           <w:sz w:val="24"/>
           <w:szCs w:val="24"/>
         </w:rPr>
-        <w:t xml:space="preserve">, une zone tampon pour les paquets en surnombre. Le transfert massif joue les camions : il remplit la file. Les petits messages urgents attendent derrière. Le phénomène s'appelle le </w:t>
+        <w:t xml:space="preserve"> (une zone mémoire où les paquets patientent avant de partir). Quand quelqu'un télécharge un gros fichier, la file se remplit de ses paquets. Le petit message urgent arrive derrière. Il attend. Longtemps.</w:t>
+      </w:r>
+    </w:p>
+    <w:p>
+      <w:pPr>
+        <w:spacing w:after="140" w:before="0" w:line="360"/>
+        <w:ind w:firstLine="709"/>
+        <w:jc w:val="both"/>
+      </w:pPr>
+      <w:r>
+        <w:rPr>
+          <w:rFonts w:ascii="Times New Roman" w:cs="Times New Roman" w:eastAsia="Times New Roman" w:hAnsi="Times New Roman"/>
+          <w:b w:val="false"/>
+          <w:bCs w:val="false"/>
+          <w:i w:val="false"/>
+          <w:iCs w:val="false"/>
+          <w:sz w:val="24"/>
+          <w:szCs w:val="24"/>
+        </w:rPr>
+        <w:t xml:space="preserve">Ce phénomène a un nom : le </w:t>
       </w:r>
       <w:r>
         <w:rPr>
@@ -560,50 +540,31 @@
           <w:sz w:val="24"/>
           <w:szCs w:val="24"/>
         </w:rPr>
-        <w:t xml:space="preserve"> : l'attente gonfle, le service semble planté.</w:t>
-      </w:r>
-    </w:p>
-    <w:p>
-      <w:pPr>
-        <w:spacing w:after="120" w:before="0" w:line="360"/>
-        <w:ind w:firstLine="709"/>
-        <w:jc w:val="both"/>
-      </w:pPr>
-      <w:r>
-        <w:rPr>
-          <w:rFonts w:ascii="Times New Roman" w:cs="Times New Roman" w:eastAsia="Times New Roman" w:hAnsi="Times New Roman"/>
-          <w:b w:val="false"/>
-          <w:bCs w:val="false"/>
-          <w:i w:val="false"/>
-          <w:iCs w:val="false"/>
-          <w:sz w:val="24"/>
-          <w:szCs w:val="24"/>
-        </w:rPr>
-        <w:t xml:space="preserve">Le piège : le </w:t>
-      </w:r>
-      <w:r>
-        <w:rPr>
-          <w:rFonts w:ascii="Times New Roman" w:cs="Times New Roman" w:eastAsia="Times New Roman" w:hAnsi="Times New Roman"/>
-          <w:b/>
-          <w:bCs/>
-          <w:i w:val="false"/>
-          <w:iCs w:val="false"/>
-          <w:sz w:val="24"/>
-          <w:szCs w:val="24"/>
-        </w:rPr>
-        <w:t xml:space="preserve">débit</w:t>
-      </w:r>
-      <w:r>
-        <w:rPr>
-          <w:rFonts w:ascii="Times New Roman" w:cs="Times New Roman" w:eastAsia="Times New Roman" w:hAnsi="Times New Roman"/>
-          <w:b w:val="false"/>
-          <w:bCs w:val="false"/>
-          <w:i w:val="false"/>
-          <w:iCs w:val="false"/>
-          <w:sz w:val="24"/>
-          <w:szCs w:val="24"/>
-        </w:rPr>
-        <w:t xml:space="preserve">, la quantité de données par seconde, reste intact. Ce qui explose, c'est la </w:t>
+        <w:t xml:space="preserve"> (littéralement « la file qui gonfle » : buffer = file d'attente, bloat = gonflement). Sa particularité trompeuse : </w:t>
+      </w:r>
+      <w:r>
+        <w:rPr>
+          <w:rFonts w:ascii="Times New Roman" w:cs="Times New Roman" w:eastAsia="Times New Roman" w:hAnsi="Times New Roman"/>
+          <w:b/>
+          <w:bCs/>
+          <w:i w:val="false"/>
+          <w:iCs w:val="false"/>
+          <w:sz w:val="24"/>
+          <w:szCs w:val="24"/>
+        </w:rPr>
+        <w:t xml:space="preserve">le débit (la quantité de données par seconde) reste intact</w:t>
+      </w:r>
+      <w:r>
+        <w:rPr>
+          <w:rFonts w:ascii="Times New Roman" w:cs="Times New Roman" w:eastAsia="Times New Roman" w:hAnsi="Times New Roman"/>
+          <w:b w:val="false"/>
+          <w:bCs w:val="false"/>
+          <w:i w:val="false"/>
+          <w:iCs w:val="false"/>
+          <w:sz w:val="24"/>
+          <w:szCs w:val="24"/>
+        </w:rPr>
+        <w:t xml:space="preserve">. Ce qui se dégrade, c'est la </w:t>
       </w:r>
       <w:r>
         <w:rPr>
@@ -627,7 +588,7 @@
           <w:sz w:val="24"/>
           <w:szCs w:val="24"/>
         </w:rPr>
-        <w:t xml:space="preserve">, le temps de réponse. Une consultation qui prend normalement cent millisecondes peut en prendre trois cents pendant un téléchargement. Un test de débit dirait que tout va bien : il ment par omission.</w:t>
+        <w:t xml:space="preserve"> (le temps de réponse : la durée entre « j'envoie » et « je reçois la réponse »).</w:t>
       </w:r>
     </w:p>
     <w:p>
@@ -635,7 +596,7 @@
         <w:pBdr>
           <w:left w:val="single" w:color="9DB4CE" w:sz="6"/>
         </w:pBdr>
-        <w:spacing w:after="160" w:before="80" w:line="340"/>
+        <w:spacing w:after="180" w:before="80" w:line="340"/>
         <w:ind w:left="850" w:right="454"/>
         <w:jc w:val="both"/>
       </w:pPr>
@@ -645,12 +606,12 @@
           <w:sz w:val="23"/>
           <w:szCs w:val="23"/>
         </w:rPr>
-        <w:t xml:space="preserve">Concrètement à Météo Madagascar : pendant qu'une image satellite descend sur le lien 4G, le tableau de bord des alertes met trois fois plus de temps à répondre. Rien n'est cassé, rien n'est lent en apparence. Le service est juste devenu inutilisable au moment où il compte.</w:t>
-      </w:r>
-    </w:p>
-    <w:p>
-      <w:pPr>
-        <w:spacing w:after="120" w:before="0" w:line="360"/>
+        <w:t xml:space="preserve">Sur le lien 4G de Météo Madagascar : pendant qu'une image satellite de plusieurs gigaoctets descend, le tableau de bord des alertes ne répond plus pendant de longues secondes. Un test de débit dirait « tout va bien ». Il ment : il mesure le camion, pas la voiture.</w:t>
+      </w:r>
+    </w:p>
+    <w:p>
+      <w:pPr>
+        <w:spacing w:after="140" w:before="0" w:line="360"/>
         <w:ind w:firstLine="709"/>
         <w:jc w:val="both"/>
       </w:pPr>
@@ -664,7 +625,7 @@
           <w:sz w:val="24"/>
           <w:szCs w:val="24"/>
         </w:rPr>
-        <w:t xml:space="preserve">Retiens l'essentiel : </w:t>
+        <w:t xml:space="preserve">Retiens la phrase qui fonde tout le mémoire : </w:t>
       </w:r>
       <w:r>
         <w:rPr>
@@ -688,24 +649,7 @@
           <w:sz w:val="24"/>
           <w:szCs w:val="24"/>
         </w:rPr>
-        <w:t xml:space="preserve">. Toute la suite du mémoire découle de cette phrase.</w:t>
-      </w:r>
-    </w:p>
-    <w:p>
-      <w:pPr>
-        <w:spacing w:after="200" w:before="160" w:line="360"/>
-        <w:ind w:left="454"/>
-        <w:jc w:val="both"/>
-      </w:pPr>
-      <w:r>
-        <w:rPr>
-          <w:rFonts w:ascii="Times New Roman" w:cs="Times New Roman" w:eastAsia="Times New Roman" w:hAnsi="Times New Roman"/>
-          <w:i/>
-          <w:iCs/>
-          <w:sz w:val="24"/>
-          <w:szCs w:val="24"/>
-        </w:rPr>
-        <w:t xml:space="preserve">Maintenant que tu vois le péage embouteillé, la question devient : qui peut tenir la file courte ? Deux familles de remèdes existent, et c'est l'objet de la section suivante.</w:t>
+        <w:t xml:space="preserve">. Tout ce qui suit cherche à mesurer cette latence et à la protéger.</w:t>
       </w:r>
     </w:p>
     <w:p>
@@ -714,7 +658,7 @@
           <w:top w:val="single" w:color="808080" w:sz="4"/>
           <w:bottom w:val="single" w:color="808080" w:sz="4"/>
         </w:pBdr>
-        <w:spacing w:after="240" w:before="200" w:line="340"/>
+        <w:spacing w:after="260" w:before="220" w:line="340"/>
         <w:ind w:left="454" w:right="454"/>
       </w:pPr>
       <w:r>
@@ -737,7 +681,23 @@
           <w:sz w:val="23"/>
           <w:szCs w:val="23"/>
         </w:rPr>
-        <w:t xml:space="preserve">Dessine le péage : un camion « transfert massif » devant, une voiture « alerte » derrière. Écris sous ton dessin, en une phrase, pourquoi la voiture attend alors que le péage n'est pas en panne.</w:t>
+        <w:t xml:space="preserve">Dessine le péage : cent camions, une voiture derrière. Sous ton dessin, réponds en une phrase : pourquoi la voiture attend-elle alors que le guichet n'est pas en panne ?</w:t>
+      </w:r>
+    </w:p>
+    <w:p>
+      <w:pPr>
+        <w:spacing w:after="160" w:line="340"/>
+        <w:ind w:left="454"/>
+      </w:pPr>
+      <w:r>
+        <w:rPr>
+          <w:rFonts w:ascii="Times New Roman" w:cs="Times New Roman" w:eastAsia="Times New Roman" w:hAnsi="Times New Roman"/>
+          <w:i/>
+          <w:iCs/>
+          <w:sz w:val="23"/>
+          <w:szCs w:val="23"/>
+        </w:rPr>
+        <w:t xml:space="preserve">Le problème est posé. Question suivante : qui peut tenir la file courte ? Deux réponses existent, et les connaître change la façon de configurer le réseau.</w:t>
       </w:r>
     </w:p>
     <w:p>
@@ -752,12 +712,28 @@
           <w:sz w:val="32"/>
           <w:szCs w:val="32"/>
         </w:rPr>
-        <w:t xml:space="preserve">3. Les remèdes : des agents au péage</w:t>
-      </w:r>
-    </w:p>
-    <w:p>
-      <w:pPr>
-        <w:spacing w:after="120" w:before="0" w:line="360"/>
+        <w:t xml:space="preserve">3. Deux endroits où agir : la file et l'émetteur</w:t>
+      </w:r>
+    </w:p>
+    <w:p>
+      <w:pPr>
+        <w:spacing w:after="160" w:line="340"/>
+        <w:ind w:left="454"/>
+      </w:pPr>
+      <w:r>
+        <w:rPr>
+          <w:rFonts w:ascii="Times New Roman" w:cs="Times New Roman" w:eastAsia="Times New Roman" w:hAnsi="Times New Roman"/>
+          <w:i/>
+          <w:iCs/>
+          <w:sz w:val="23"/>
+          <w:szCs w:val="23"/>
+        </w:rPr>
+        <w:t xml:space="preserve">Pourquoi cette section ? Parce qu'un remède seul ne suffit pas : il faut savoir que le problème a deux causes, donc deux leviers.</w:t>
+      </w:r>
+    </w:p>
+    <w:p>
+      <w:pPr>
+        <w:spacing w:after="140" w:before="0" w:line="360"/>
         <w:ind w:firstLine="709"/>
         <w:jc w:val="both"/>
       </w:pPr>
@@ -771,7 +747,31 @@
           <w:sz w:val="24"/>
           <w:szCs w:val="24"/>
         </w:rPr>
-        <w:t xml:space="preserve">Premier levier : la </w:t>
+        <w:t xml:space="preserve">Premier endroit : </w:t>
+      </w:r>
+      <w:r>
+        <w:rPr>
+          <w:rFonts w:ascii="Times New Roman" w:cs="Times New Roman" w:eastAsia="Times New Roman" w:hAnsi="Times New Roman"/>
+          <w:b/>
+          <w:bCs/>
+          <w:i w:val="false"/>
+          <w:iCs w:val="false"/>
+          <w:sz w:val="24"/>
+          <w:szCs w:val="24"/>
+        </w:rPr>
+        <w:t xml:space="preserve">la file elle-même</w:t>
+      </w:r>
+      <w:r>
+        <w:rPr>
+          <w:rFonts w:ascii="Times New Roman" w:cs="Times New Roman" w:eastAsia="Times New Roman" w:hAnsi="Times New Roman"/>
+          <w:b w:val="false"/>
+          <w:bCs w:val="false"/>
+          <w:i w:val="false"/>
+          <w:iCs w:val="false"/>
+          <w:sz w:val="24"/>
+          <w:szCs w:val="24"/>
+        </w:rPr>
+        <w:t xml:space="preserve">. La règle qui gère la file s'appelle la </w:t>
       </w:r>
       <w:r>
         <w:rPr>
@@ -795,201 +795,7 @@
           <w:sz w:val="24"/>
           <w:szCs w:val="24"/>
         </w:rPr>
-        <w:t xml:space="preserve">, la règle que l'équipement applique à sa file. Linux en propose trois, toutes testées dans le mémoire.</w:t>
-      </w:r>
-    </w:p>
-    <w:p>
-      <w:pPr>
-        <w:spacing w:after="120" w:before="0" w:line="360"/>
-        <w:ind w:firstLine="709"/>
-        <w:jc w:val="both"/>
-      </w:pPr>
-      <w:r>
-        <w:rPr>
-          <w:rFonts w:ascii="Times New Roman" w:cs="Times New Roman" w:eastAsia="Times New Roman" w:hAnsi="Times New Roman"/>
-          <w:b/>
-          <w:bCs/>
-          <w:i w:val="false"/>
-          <w:iCs w:val="false"/>
-          <w:sz w:val="24"/>
-          <w:szCs w:val="24"/>
-        </w:rPr>
-        <w:t xml:space="preserve">pfifo_fast</w:t>
-      </w:r>
-      <w:r>
-        <w:rPr>
-          <w:rFonts w:ascii="Times New Roman" w:cs="Times New Roman" w:eastAsia="Times New Roman" w:hAnsi="Times New Roman"/>
-          <w:b w:val="false"/>
-          <w:bCs w:val="false"/>
-          <w:i w:val="false"/>
-          <w:iCs w:val="false"/>
-          <w:sz w:val="24"/>
-          <w:szCs w:val="24"/>
-        </w:rPr>
-        <w:t xml:space="preserve"> est le péage sans agent : premier arrivé, premier servi, la file grandit tant qu'elle veut. </w:t>
-      </w:r>
-      <w:r>
-        <w:rPr>
-          <w:rFonts w:ascii="Times New Roman" w:cs="Times New Roman" w:eastAsia="Times New Roman" w:hAnsi="Times New Roman"/>
-          <w:b/>
-          <w:bCs/>
-          <w:i w:val="false"/>
-          <w:iCs w:val="false"/>
-          <w:sz w:val="24"/>
-          <w:szCs w:val="24"/>
-        </w:rPr>
-        <w:t xml:space="preserve">fq_codel</w:t>
-      </w:r>
-      <w:r>
-        <w:rPr>
-          <w:rFonts w:ascii="Times New Roman" w:cs="Times New Roman" w:eastAsia="Times New Roman" w:hAnsi="Times New Roman"/>
-          <w:b w:val="false"/>
-          <w:bCs w:val="false"/>
-          <w:i w:val="false"/>
-          <w:iCs w:val="false"/>
-          <w:sz w:val="24"/>
-          <w:szCs w:val="24"/>
-        </w:rPr>
-        <w:t xml:space="preserve"> est l'agent vigilant : il surveille l'attente et écarte quelques paquets à l'avance pour forcer les émetteurs à ralentir. </w:t>
-      </w:r>
-      <w:r>
-        <w:rPr>
-          <w:rFonts w:ascii="Times New Roman" w:cs="Times New Roman" w:eastAsia="Times New Roman" w:hAnsi="Times New Roman"/>
-          <w:b/>
-          <w:bCs/>
-          <w:i w:val="false"/>
-          <w:iCs w:val="false"/>
-          <w:sz w:val="24"/>
-          <w:szCs w:val="24"/>
-        </w:rPr>
-        <w:t xml:space="preserve">CAKE</w:t>
-      </w:r>
-      <w:r>
-        <w:rPr>
-          <w:rFonts w:ascii="Times New Roman" w:cs="Times New Roman" w:eastAsia="Times New Roman" w:hAnsi="Times New Roman"/>
-          <w:b w:val="false"/>
-          <w:bCs w:val="false"/>
-          <w:i w:val="false"/>
-          <w:iCs w:val="false"/>
-          <w:sz w:val="24"/>
-          <w:szCs w:val="24"/>
-        </w:rPr>
-        <w:t xml:space="preserve"> est l'agent complet : la même vigilance, plus un plafond de débit et un traitement équitable par flux. fq_codel et CAKE sont dites </w:t>
-      </w:r>
-      <w:r>
-        <w:rPr>
-          <w:rFonts w:ascii="Times New Roman" w:cs="Times New Roman" w:eastAsia="Times New Roman" w:hAnsi="Times New Roman"/>
-          <w:b/>
-          <w:bCs/>
-          <w:i w:val="false"/>
-          <w:iCs w:val="false"/>
-          <w:sz w:val="24"/>
-          <w:szCs w:val="24"/>
-        </w:rPr>
-        <w:t xml:space="preserve">actives</w:t>
-      </w:r>
-      <w:r>
-        <w:rPr>
-          <w:rFonts w:ascii="Times New Roman" w:cs="Times New Roman" w:eastAsia="Times New Roman" w:hAnsi="Times New Roman"/>
-          <w:b w:val="false"/>
-          <w:bCs w:val="false"/>
-          <w:i w:val="false"/>
-          <w:iCs w:val="false"/>
-          <w:sz w:val="24"/>
-          <w:szCs w:val="24"/>
-        </w:rPr>
-        <w:t xml:space="preserve"> : elles agissent sur la file au lieu de la subir.</w:t>
-      </w:r>
-    </w:p>
-    <w:p>
-      <w:pPr>
-        <w:spacing w:after="120" w:before="0" w:line="360"/>
-        <w:ind w:firstLine="709"/>
-        <w:jc w:val="both"/>
-      </w:pPr>
-      <w:r>
-        <w:rPr>
-          <w:rFonts w:ascii="Times New Roman" w:cs="Times New Roman" w:eastAsia="Times New Roman" w:hAnsi="Times New Roman"/>
-          <w:b w:val="false"/>
-          <w:bCs w:val="false"/>
-          <w:i w:val="false"/>
-          <w:iCs w:val="false"/>
-          <w:sz w:val="24"/>
-          <w:szCs w:val="24"/>
-        </w:rPr>
-        <w:t xml:space="preserve">Deuxième levier : le </w:t>
-      </w:r>
-      <w:r>
-        <w:rPr>
-          <w:rFonts w:ascii="Times New Roman" w:cs="Times New Roman" w:eastAsia="Times New Roman" w:hAnsi="Times New Roman"/>
-          <w:b/>
-          <w:bCs/>
-          <w:i w:val="false"/>
-          <w:iCs w:val="false"/>
-          <w:sz w:val="24"/>
-          <w:szCs w:val="24"/>
-        </w:rPr>
-        <w:t xml:space="preserve">contrôle de congestion</w:t>
-      </w:r>
-      <w:r>
-        <w:rPr>
-          <w:rFonts w:ascii="Times New Roman" w:cs="Times New Roman" w:eastAsia="Times New Roman" w:hAnsi="Times New Roman"/>
-          <w:b w:val="false"/>
-          <w:bCs w:val="false"/>
-          <w:i w:val="false"/>
-          <w:iCs w:val="false"/>
-          <w:sz w:val="24"/>
-          <w:szCs w:val="24"/>
-        </w:rPr>
-        <w:t xml:space="preserve">, la règle que suit l'émetteur pour ajuster sa vitesse. </w:t>
-      </w:r>
-      <w:r>
-        <w:rPr>
-          <w:rFonts w:ascii="Times New Roman" w:cs="Times New Roman" w:eastAsia="Times New Roman" w:hAnsi="Times New Roman"/>
-          <w:b/>
-          <w:bCs/>
-          <w:i w:val="false"/>
-          <w:iCs w:val="false"/>
-          <w:sz w:val="24"/>
-          <w:szCs w:val="24"/>
-        </w:rPr>
-        <w:t xml:space="preserve">CUBIC</w:t>
-      </w:r>
-      <w:r>
-        <w:rPr>
-          <w:rFonts w:ascii="Times New Roman" w:cs="Times New Roman" w:eastAsia="Times New Roman" w:hAnsi="Times New Roman"/>
-          <w:b w:val="false"/>
-          <w:bCs w:val="false"/>
-          <w:i w:val="false"/>
-          <w:iCs w:val="false"/>
-          <w:sz w:val="24"/>
-          <w:szCs w:val="24"/>
-        </w:rPr>
-        <w:t xml:space="preserve">, le défaut de Linux, apprend en cassant : il accélère jusqu'à perdre un paquet, puis ralentit, puis recommence. </w:t>
-      </w:r>
-      <w:r>
-        <w:rPr>
-          <w:rFonts w:ascii="Times New Roman" w:cs="Times New Roman" w:eastAsia="Times New Roman" w:hAnsi="Times New Roman"/>
-          <w:b/>
-          <w:bCs/>
-          <w:i w:val="false"/>
-          <w:iCs w:val="false"/>
-          <w:sz w:val="24"/>
-          <w:szCs w:val="24"/>
-        </w:rPr>
-        <w:t xml:space="preserve">BBR</w:t>
-      </w:r>
-      <w:r>
-        <w:rPr>
-          <w:rFonts w:ascii="Times New Roman" w:cs="Times New Roman" w:eastAsia="Times New Roman" w:hAnsi="Times New Roman"/>
-          <w:b w:val="false"/>
-          <w:bCs w:val="false"/>
-          <w:i w:val="false"/>
-          <w:iCs w:val="false"/>
-          <w:sz w:val="24"/>
-          <w:szCs w:val="24"/>
-        </w:rPr>
-        <w:t xml:space="preserve">, de Google, mesure d'abord le débit disponible et l'aller-retour minimal, puis émet pour remplir le lien sans déborder.</w:t>
+        <w:t xml:space="preserve"> (la méthode que l'équipement utilise pour décider qui part, qui attend, qui est jeté). Linux, le système des routeurs, en propose trois principales, toutes testées ici :</w:t>
       </w:r>
     </w:p>
     <w:p>
@@ -997,7 +803,7 @@
         <w:pBdr>
           <w:left w:val="single" w:color="9DB4CE" w:sz="6"/>
         </w:pBdr>
-        <w:spacing w:after="160" w:before="80" w:line="340"/>
+        <w:spacing w:after="180" w:before="80" w:line="340"/>
         <w:ind w:left="850" w:right="454"/>
         <w:jc w:val="both"/>
       </w:pPr>
@@ -1007,12 +813,15 @@
           <w:sz w:val="23"/>
           <w:szCs w:val="23"/>
         </w:rPr>
-        <w:t xml:space="preserve">BBR face au péage sans agent : il connaît sa place exacte et la tient. La file grandit quand même autour de lui. Face à un agent vigilant, la même logique devient un atout : les paquets en surnombre sont écartés tôt, la file reste courte, et le trafic urgent passe.</w:t>
-      </w:r>
-    </w:p>
-    <w:p>
-      <w:pPr>
-        <w:spacing w:after="120" w:before="0" w:line="360"/>
+        <w:t xml:space="preserve">pfifo_fast : le guichet sans agent. Premier arrivé, premier servi, la file grandit sans limite. C'est le réglage par défaut, le témoin.
+fq_codel : l'agent vigilant. Il surveille l'attente et jette quelques paquets volontairement, ce qui force les émetteurs à ralentir : la file reste courte.
+CAKE : l'agent complet. La même vigilance, plus deux raffinements : un plafond de débit (ne jamais laisser entrer plus que le lien ne peut évacuer) et un partage équitable entre les usages.
+fq_codel et CAKE sont dites « actives » : elles agissent au lieu de subir.</w:t>
+      </w:r>
+    </w:p>
+    <w:p>
+      <w:pPr>
+        <w:spacing w:after="140" w:before="0" w:line="360"/>
         <w:ind w:firstLine="709"/>
         <w:jc w:val="both"/>
       </w:pPr>
@@ -1026,48 +835,117 @@
           <w:sz w:val="24"/>
           <w:szCs w:val="24"/>
         </w:rPr>
-        <w:t xml:space="preserve">Un opérateur ne choisit pas la discipline de file des serveurs distants. Mais il contrôle </w:t>
-      </w:r>
-      <w:r>
-        <w:rPr>
-          <w:rFonts w:ascii="Times New Roman" w:cs="Times New Roman" w:eastAsia="Times New Roman" w:hAnsi="Times New Roman"/>
-          <w:b/>
-          <w:bCs/>
-          <w:i w:val="false"/>
-          <w:iCs w:val="false"/>
-          <w:sz w:val="24"/>
-          <w:szCs w:val="24"/>
-        </w:rPr>
-        <w:t xml:space="preserve">son routeur de site</w:t>
-      </w:r>
-      <w:r>
-        <w:rPr>
-          <w:rFonts w:ascii="Times New Roman" w:cs="Times New Roman" w:eastAsia="Times New Roman" w:hAnsi="Times New Roman"/>
-          <w:b w:val="false"/>
-          <w:bCs w:val="false"/>
-          <w:i w:val="false"/>
-          <w:iCs w:val="false"/>
-          <w:sz w:val="24"/>
-          <w:szCs w:val="24"/>
-        </w:rPr>
-        <w:t xml:space="preserve">. La question du mémoire : quelles combinaisons de discipline et de contrôle protègent le mieux le petit trafic de Météo Madagascar ?</w:t>
-      </w:r>
-    </w:p>
-    <w:p>
-      <w:pPr>
-        <w:spacing w:after="200" w:before="160" w:line="360"/>
-        <w:ind w:left="454"/>
-        <w:jc w:val="both"/>
-      </w:pPr>
-      <w:r>
-        <w:rPr>
-          <w:rFonts w:ascii="Times New Roman" w:cs="Times New Roman" w:eastAsia="Times New Roman" w:hAnsi="Times New Roman"/>
-          <w:i/>
-          <w:iCs/>
-          <w:sz w:val="24"/>
-          <w:szCs w:val="24"/>
-        </w:rPr>
-        <w:t xml:space="preserve">Pour répondre, il faut comparer ces combinaisons dans des conditions identiques et reproductibles. C'est exactement ce que fait le banc d'essai, présenté maintenant.</w:t>
+        <w:t xml:space="preserve">Deuxième endroit : </w:t>
+      </w:r>
+      <w:r>
+        <w:rPr>
+          <w:rFonts w:ascii="Times New Roman" w:cs="Times New Roman" w:eastAsia="Times New Roman" w:hAnsi="Times New Roman"/>
+          <w:b/>
+          <w:bCs/>
+          <w:i w:val="false"/>
+          <w:iCs w:val="false"/>
+          <w:sz w:val="24"/>
+          <w:szCs w:val="24"/>
+        </w:rPr>
+        <w:t xml:space="preserve">l'émetteur</w:t>
+      </w:r>
+      <w:r>
+        <w:rPr>
+          <w:rFonts w:ascii="Times New Roman" w:cs="Times New Roman" w:eastAsia="Times New Roman" w:hAnsi="Times New Roman"/>
+          <w:b w:val="false"/>
+          <w:bCs w:val="false"/>
+          <w:i w:val="false"/>
+          <w:iCs w:val="false"/>
+          <w:sz w:val="24"/>
+          <w:szCs w:val="24"/>
+        </w:rPr>
+        <w:t xml:space="preserve">, celui qui envoie les données. Sa règle s'appelle le </w:t>
+      </w:r>
+      <w:r>
+        <w:rPr>
+          <w:rFonts w:ascii="Times New Roman" w:cs="Times New Roman" w:eastAsia="Times New Roman" w:hAnsi="Times New Roman"/>
+          <w:b/>
+          <w:bCs/>
+          <w:i w:val="false"/>
+          <w:iCs w:val="false"/>
+          <w:sz w:val="24"/>
+          <w:szCs w:val="24"/>
+        </w:rPr>
+        <w:t xml:space="preserve">contrôle de congestion</w:t>
+      </w:r>
+      <w:r>
+        <w:rPr>
+          <w:rFonts w:ascii="Times New Roman" w:cs="Times New Roman" w:eastAsia="Times New Roman" w:hAnsi="Times New Roman"/>
+          <w:b w:val="false"/>
+          <w:bCs w:val="false"/>
+          <w:i w:val="false"/>
+          <w:iCs w:val="false"/>
+          <w:sz w:val="24"/>
+          <w:szCs w:val="24"/>
+        </w:rPr>
+        <w:t xml:space="preserve"> (la méthode dont il se sert pour deviner à quelle vitesse il peut envoyer sans noyer le réseau). Deux écoles :</w:t>
+      </w:r>
+    </w:p>
+    <w:p>
+      <w:pPr>
+        <w:pBdr>
+          <w:left w:val="single" w:color="9DB4CE" w:sz="6"/>
+        </w:pBdr>
+        <w:spacing w:after="180" w:before="80" w:line="340"/>
+        <w:ind w:left="850" w:right="454"/>
+        <w:jc w:val="both"/>
+      </w:pPr>
+      <w:r>
+        <w:rPr>
+          <w:rFonts w:ascii="Times New Roman" w:cs="Times New Roman" w:eastAsia="Times New Roman" w:hAnsi="Times New Roman"/>
+          <w:sz w:val="23"/>
+          <w:szCs w:val="23"/>
+        </w:rPr>
+        <w:t xml:space="preserve">CUBIC : l'écolier qui apprend en se cognant. Il accélère jusqu'à ce qu'un paquet soit perdu, déduit qu'il est allé trop vite, ralentit, puis recommence. C'est le réglage par défaut de Linux.
+BBR : l'écolier qui mesure d'abord. Il estime le débit disponible et le temps minimum du trajet, puis envoie exactement cette quantité, sans attendre de casser quelque chose.</w:t>
+      </w:r>
+    </w:p>
+    <w:p>
+      <w:pPr>
+        <w:spacing w:after="140" w:before="0" w:line="360"/>
+        <w:ind w:firstLine="709"/>
+        <w:jc w:val="both"/>
+      </w:pPr>
+      <w:r>
+        <w:rPr>
+          <w:rFonts w:ascii="Times New Roman" w:cs="Times New Roman" w:eastAsia="Times New Roman" w:hAnsi="Times New Roman"/>
+          <w:b w:val="false"/>
+          <w:bCs w:val="false"/>
+          <w:i w:val="false"/>
+          <w:iCs w:val="false"/>
+          <w:sz w:val="24"/>
+          <w:szCs w:val="24"/>
+        </w:rPr>
+        <w:t xml:space="preserve">Pourquoi tester les deux ensembles ? Parce qu'un opérateur institutionnel ne choisit pas la discipline des serveurs lointains. Mais </w:t>
+      </w:r>
+      <w:r>
+        <w:rPr>
+          <w:rFonts w:ascii="Times New Roman" w:cs="Times New Roman" w:eastAsia="Times New Roman" w:hAnsi="Times New Roman"/>
+          <w:b/>
+          <w:bCs/>
+          <w:i w:val="false"/>
+          <w:iCs w:val="false"/>
+          <w:sz w:val="24"/>
+          <w:szCs w:val="24"/>
+        </w:rPr>
+        <w:t xml:space="preserve">il contrôle son propre routeur</w:t>
+      </w:r>
+      <w:r>
+        <w:rPr>
+          <w:rFonts w:ascii="Times New Roman" w:cs="Times New Roman" w:eastAsia="Times New Roman" w:hAnsi="Times New Roman"/>
+          <w:b w:val="false"/>
+          <w:bCs w:val="false"/>
+          <w:i w:val="false"/>
+          <w:iCs w:val="false"/>
+          <w:sz w:val="24"/>
+          <w:szCs w:val="24"/>
+        </w:rPr>
+        <w:t xml:space="preserve"> et parfois ses émetteurs. Il a besoin de savoir quelles combinaisons protègent son trafic urgent. C'est une question de terrain, pas de curiosité.</w:t>
       </w:r>
     </w:p>
     <w:p>
@@ -1076,7 +954,7 @@
           <w:top w:val="single" w:color="808080" w:sz="4"/>
           <w:bottom w:val="single" w:color="808080" w:sz="4"/>
         </w:pBdr>
-        <w:spacing w:after="240" w:before="200" w:line="340"/>
+        <w:spacing w:after="260" w:before="220" w:line="340"/>
         <w:ind w:left="454" w:right="454"/>
       </w:pPr>
       <w:r>
@@ -1099,7 +977,23 @@
           <w:sz w:val="23"/>
           <w:szCs w:val="23"/>
         </w:rPr>
-        <w:t xml:space="preserve">Relie par deux flèches : « CAKE » vers « file courte », puis « file courte » vers « alerte à l'heure ». Sur chaque flèche, écris en trois mots le mécanisme.</w:t>
+        <w:t xml:space="preserve">Deux flèches à tracer : « CAKE » vers « file courte », puis « file courte » vers « alerte à l'heure ». Sur chaque flèche, le mécanisme en trois mots.</w:t>
+      </w:r>
+    </w:p>
+    <w:p>
+      <w:pPr>
+        <w:spacing w:after="160" w:line="340"/>
+        <w:ind w:left="454"/>
+      </w:pPr>
+      <w:r>
+        <w:rPr>
+          <w:rFonts w:ascii="Times New Roman" w:cs="Times New Roman" w:eastAsia="Times New Roman" w:hAnsi="Times New Roman"/>
+          <w:i/>
+          <w:iCs/>
+          <w:sz w:val="23"/>
+          <w:szCs w:val="23"/>
+        </w:rPr>
+        <w:t xml:space="preserve">Les remèdes sont nommés. Question suivante : comment les comparer loyalement ? Il faudrait un réseau d'essai identique à chaque fois. C'est le banc.</w:t>
       </w:r>
     </w:p>
     <w:p>
@@ -1114,12 +1008,28 @@
           <w:sz w:val="32"/>
           <w:szCs w:val="32"/>
         </w:rPr>
-        <w:t xml:space="preserve">4. Le banc : rejouer le lien sans rien casser</w:t>
-      </w:r>
-    </w:p>
-    <w:p>
-      <w:pPr>
-        <w:spacing w:after="120" w:before="0" w:line="360"/>
+        <w:t xml:space="preserve">4. Le banc : un réseau d'essai dans un seul ordinateur</w:t>
+      </w:r>
+    </w:p>
+    <w:p>
+      <w:pPr>
+        <w:spacing w:after="160" w:line="340"/>
+        <w:ind w:left="454"/>
+      </w:pPr>
+      <w:r>
+        <w:rPr>
+          <w:rFonts w:ascii="Times New Roman" w:cs="Times New Roman" w:eastAsia="Times New Roman" w:hAnsi="Times New Roman"/>
+          <w:i/>
+          <w:iCs/>
+          <w:sz w:val="23"/>
+          <w:szCs w:val="23"/>
+        </w:rPr>
+        <w:t xml:space="preserve">Pourquoi cette section ? Parce que sans banc, aucune comparaison n'est loyale : le réseau réel change tout le temps.</w:t>
+      </w:r>
+    </w:p>
+    <w:p>
+      <w:pPr>
+        <w:spacing w:after="140" w:before="0" w:line="360"/>
         <w:ind w:firstLine="709"/>
         <w:jc w:val="both"/>
       </w:pPr>
@@ -1133,31 +1043,50 @@
           <w:sz w:val="24"/>
           <w:szCs w:val="24"/>
         </w:rPr>
-        <w:t xml:space="preserve">Le banc s'installe sur </w:t>
-      </w:r>
-      <w:r>
-        <w:rPr>
-          <w:rFonts w:ascii="Times New Roman" w:cs="Times New Roman" w:eastAsia="Times New Roman" w:hAnsi="Times New Roman"/>
-          <w:b/>
-          <w:bCs/>
-          <w:i w:val="false"/>
-          <w:iCs w:val="false"/>
-          <w:sz w:val="24"/>
-          <w:szCs w:val="24"/>
-        </w:rPr>
-        <w:t xml:space="preserve">le poste client lui-même</w:t>
-      </w:r>
-      <w:r>
-        <w:rPr>
-          <w:rFonts w:ascii="Times New Roman" w:cs="Times New Roman" w:eastAsia="Times New Roman" w:hAnsi="Times New Roman"/>
-          <w:b w:val="false"/>
-          <w:bCs w:val="false"/>
-          <w:i w:val="false"/>
-          <w:iCs w:val="false"/>
-          <w:sz w:val="24"/>
-          <w:szCs w:val="24"/>
-        </w:rPr>
-        <w:t xml:space="preserve">. Un programme unique, nommé </w:t>
+        <w:t xml:space="preserve">Le problème pour comparer : sur un réseau réel, tout bouge. La charge des collègues, la météo radio, le moment de la journée. Tu ne peux jamais rejouer deux fois la même chose. La solution : </w:t>
+      </w:r>
+      <w:r>
+        <w:rPr>
+          <w:rFonts w:ascii="Times New Roman" w:cs="Times New Roman" w:eastAsia="Times New Roman" w:hAnsi="Times New Roman"/>
+          <w:b/>
+          <w:bCs/>
+          <w:i w:val="false"/>
+          <w:iCs w:val="false"/>
+          <w:sz w:val="24"/>
+          <w:szCs w:val="24"/>
+        </w:rPr>
+        <w:t xml:space="preserve">rejouer le lien dans un ordinateur, à l'identique, autant de fois qu'on veut</w:t>
+      </w:r>
+      <w:r>
+        <w:rPr>
+          <w:rFonts w:ascii="Times New Roman" w:cs="Times New Roman" w:eastAsia="Times New Roman" w:hAnsi="Times New Roman"/>
+          <w:b w:val="false"/>
+          <w:bCs w:val="false"/>
+          <w:i w:val="false"/>
+          <w:iCs w:val="false"/>
+          <w:sz w:val="24"/>
+          <w:szCs w:val="24"/>
+        </w:rPr>
+        <w:t xml:space="preserve">.</w:t>
+      </w:r>
+    </w:p>
+    <w:p>
+      <w:pPr>
+        <w:spacing w:after="140" w:before="0" w:line="360"/>
+        <w:ind w:firstLine="709"/>
+        <w:jc w:val="both"/>
+      </w:pPr>
+      <w:r>
+        <w:rPr>
+          <w:rFonts w:ascii="Times New Roman" w:cs="Times New Roman" w:eastAsia="Times New Roman" w:hAnsi="Times New Roman"/>
+          <w:b w:val="false"/>
+          <w:bCs w:val="false"/>
+          <w:i w:val="false"/>
+          <w:iCs w:val="false"/>
+          <w:sz w:val="24"/>
+          <w:szCs w:val="24"/>
+        </w:rPr>
+        <w:t xml:space="preserve">L'outil s'appelle </w:t>
       </w:r>
       <w:r>
         <w:rPr>
@@ -1181,7 +1110,7 @@
           <w:sz w:val="24"/>
           <w:szCs w:val="24"/>
         </w:rPr>
-        <w:t xml:space="preserve">, crée une paire de liens virtuels dans la machine. Sur l'un, un module nommé </w:t>
+        <w:t xml:space="preserve">. Il crée dans la machine une paire de liens virtuels (deux prises réseau fictives, reliées par un câble fictif). Sur ce lien fictif, un module nommé </w:t>
       </w:r>
       <w:r>
         <w:rPr>
@@ -1205,26 +1134,38 @@
           <w:sz w:val="24"/>
           <w:szCs w:val="24"/>
         </w:rPr>
-        <w:t xml:space="preserve"> impose au trafic le délai, la gigue et la perte du profil choisi : le poste se fait croire qu'il parle à un lien 4G ou satellite, alors que tout reste local. Par-dessus s'applique la discipline testée.</w:t>
-      </w:r>
-    </w:p>
-    <w:p>
-      <w:pPr>
-        <w:spacing w:after="120" w:before="0" w:line="360"/>
+        <w:t xml:space="preserve"> (émulateur réseau : il déforme volontairement les paquets) impose le délai, la gigue (variation du délai) et le taux de perte d'un vrai lien malgache. La discipline testée s'applique par-dessus.</w:t>
+      </w:r>
+    </w:p>
+    <w:p>
+      <w:pPr>
+        <w:spacing w:after="140" w:before="0" w:line="360"/>
         <w:ind w:firstLine="709"/>
         <w:jc w:val="both"/>
       </w:pPr>
       <w:r>
         <w:rPr>
           <w:rFonts w:ascii="Times New Roman" w:cs="Times New Roman" w:eastAsia="Times New Roman" w:hAnsi="Times New Roman"/>
-          <w:b w:val="false"/>
-          <w:bCs w:val="false"/>
-          <w:i w:val="false"/>
-          <w:iCs w:val="false"/>
-          <w:sz w:val="24"/>
-          <w:szCs w:val="24"/>
-        </w:rPr>
-        <w:t xml:space="preserve">Aucun équipement de production n'est modifié, aucune donnée réelle n'est consommée. C'est la condition pour expérimenter librement dans une institution de sécurité.</w:t>
+          <w:b/>
+          <w:bCs/>
+          <w:i w:val="false"/>
+          <w:iCs w:val="false"/>
+          <w:sz w:val="24"/>
+          <w:szCs w:val="24"/>
+        </w:rPr>
+        <w:t xml:space="preserve">L'ordinateur se fait croire qu'il parle à une 4G de Yas ; en réalité, rien ne quitte la pièce</w:t>
+      </w:r>
+      <w:r>
+        <w:rPr>
+          <w:rFonts w:ascii="Times New Roman" w:cs="Times New Roman" w:eastAsia="Times New Roman" w:hAnsi="Times New Roman"/>
+          <w:b w:val="false"/>
+          <w:bCs w:val="false"/>
+          <w:i w:val="false"/>
+          <w:iCs w:val="false"/>
+          <w:sz w:val="24"/>
+          <w:szCs w:val="24"/>
+        </w:rPr>
+        <w:t xml:space="preserve">. Aucun équipement réel n'est touché, aucune donnée réelle n'est consommée.</w:t>
       </w:r>
     </w:p>
     <w:p>
@@ -1235,7 +1176,7 @@
       <w:r>
         <w:drawing>
           <wp:inline distT="0" distB="0" distL="0" distR="0">
-            <wp:extent cx="5334000" cy="2247900"/>
+            <wp:extent cx="4733925" cy="2000250"/>
             <wp:effectExtent t="0" r="0" b="0" l="0"/>
             <wp:docPr id="1" name="" descr="" title=""/>
             <wp:cNvGraphicFramePr>
@@ -1260,7 +1201,7 @@
                   <pic:spPr bwMode="auto">
                     <a:xfrm>
                       <a:off x="0" y="0"/>
-                      <a:ext cx="5334000" cy="2247900"/>
+                      <a:ext cx="4733925" cy="2000250"/>
                     </a:xfrm>
                     <a:prstGeom prst="rect">
                       <a:avLst/>
@@ -1286,12 +1227,12 @@
           <w:sz w:val="22"/>
           <w:szCs w:val="22"/>
         </w:rPr>
-        <w:t xml:space="preserve">La topologie du banc : le poste client rejoue le lien d'accès, l'infrastructure reste intacte.</w:t>
-      </w:r>
-    </w:p>
-    <w:p>
-      <w:pPr>
-        <w:spacing w:after="120" w:before="0" w:line="360"/>
+        <w:t xml:space="preserve">Le banc : le poste de travail rejoue le lien d'accès. Aucun équipement réel n'est touché.</w:t>
+      </w:r>
+    </w:p>
+    <w:p>
+      <w:pPr>
+        <w:spacing w:after="140" w:before="0" w:line="360"/>
         <w:ind w:firstLine="709"/>
         <w:jc w:val="both"/>
       </w:pPr>
@@ -1329,108 +1270,12 @@
           <w:sz w:val="24"/>
           <w:szCs w:val="24"/>
         </w:rPr>
-        <w:t xml:space="preserve"> de lien sont rejoués : </w:t>
-      </w:r>
-      <w:r>
-        <w:rPr>
-          <w:rFonts w:ascii="Times New Roman" w:cs="Times New Roman" w:eastAsia="Times New Roman" w:hAnsi="Times New Roman"/>
-          <w:b/>
-          <w:bCs/>
-          <w:i w:val="false"/>
-          <w:iCs w:val="false"/>
-          <w:sz w:val="24"/>
-          <w:szCs w:val="24"/>
-        </w:rPr>
-        <w:t xml:space="preserve">P1</w:t>
-      </w:r>
-      <w:r>
-        <w:rPr>
-          <w:rFonts w:ascii="Times New Roman" w:cs="Times New Roman" w:eastAsia="Times New Roman" w:hAnsi="Times New Roman"/>
-          <w:b w:val="false"/>
-          <w:bCs w:val="false"/>
-          <w:i w:val="false"/>
-          <w:iCs w:val="false"/>
-          <w:sz w:val="24"/>
-          <w:szCs w:val="24"/>
-        </w:rPr>
-        <w:t xml:space="preserve"> la fibre du siège, 80 mégabits et 20 millisecondes ; </w:t>
-      </w:r>
-      <w:r>
-        <w:rPr>
-          <w:rFonts w:ascii="Times New Roman" w:cs="Times New Roman" w:eastAsia="Times New Roman" w:hAnsi="Times New Roman"/>
-          <w:b/>
-          <w:bCs/>
-          <w:i w:val="false"/>
-          <w:iCs w:val="false"/>
-          <w:sz w:val="24"/>
-          <w:szCs w:val="24"/>
-        </w:rPr>
-        <w:t xml:space="preserve">P2</w:t>
-      </w:r>
-      <w:r>
-        <w:rPr>
-          <w:rFonts w:ascii="Times New Roman" w:cs="Times New Roman" w:eastAsia="Times New Roman" w:hAnsi="Times New Roman"/>
-          <w:b w:val="false"/>
-          <w:bCs w:val="false"/>
-          <w:i w:val="false"/>
-          <w:iCs w:val="false"/>
-          <w:sz w:val="24"/>
-          <w:szCs w:val="24"/>
-        </w:rPr>
-        <w:t xml:space="preserve"> la 4G de Yas, 20 mégabits, 100 millisecondes, un demi-point de perte : le cas d'étude central ; </w:t>
-      </w:r>
-      <w:r>
-        <w:rPr>
-          <w:rFonts w:ascii="Times New Roman" w:cs="Times New Roman" w:eastAsia="Times New Roman" w:hAnsi="Times New Roman"/>
-          <w:b/>
-          <w:bCs/>
-          <w:i w:val="false"/>
-          <w:iCs w:val="false"/>
-          <w:sz w:val="24"/>
-          <w:szCs w:val="24"/>
-        </w:rPr>
-        <w:t xml:space="preserve">P3</w:t>
-      </w:r>
-      <w:r>
-        <w:rPr>
-          <w:rFonts w:ascii="Times New Roman" w:cs="Times New Roman" w:eastAsia="Times New Roman" w:hAnsi="Times New Roman"/>
-          <w:b w:val="false"/>
-          <w:bCs w:val="false"/>
-          <w:i w:val="false"/>
-          <w:iCs w:val="false"/>
-          <w:sz w:val="24"/>
-          <w:szCs w:val="24"/>
-        </w:rPr>
-        <w:t xml:space="preserve"> le VSAT isolé, 5 mégabits et 600 millisecondes ; </w:t>
-      </w:r>
-      <w:r>
-        <w:rPr>
-          <w:rFonts w:ascii="Times New Roman" w:cs="Times New Roman" w:eastAsia="Times New Roman" w:hAnsi="Times New Roman"/>
-          <w:b/>
-          <w:bCs/>
-          <w:i w:val="false"/>
-          <w:iCs w:val="false"/>
-          <w:sz w:val="24"/>
-          <w:szCs w:val="24"/>
-        </w:rPr>
-        <w:t xml:space="preserve">P4</w:t>
-      </w:r>
-      <w:r>
-        <w:rPr>
-          <w:rFonts w:ascii="Times New Roman" w:cs="Times New Roman" w:eastAsia="Times New Roman" w:hAnsi="Times New Roman"/>
-          <w:b w:val="false"/>
-          <w:bCs w:val="false"/>
-          <w:i w:val="false"/>
-          <w:iCs w:val="false"/>
-          <w:sz w:val="24"/>
-          <w:szCs w:val="24"/>
-        </w:rPr>
-        <w:t xml:space="preserve"> Starlink, 100 mégabits et 40 millisecondes avec une gigue marquée.</w:t>
-      </w:r>
-    </w:p>
-    <w:p>
-      <w:pPr>
-        <w:spacing w:after="120" w:before="0" w:line="360"/>
+        <w:t xml:space="preserve"> (modèles de lien) sont rejoués : P1 la fibre du siège (80 mégabits, 20 millisecondes), P2 la 4G de Yas (20 mégabits, 100 millisecondes, 0,5 % de perte : le cas central), P3 le VSAT (5 mégabits, 600 millisecondes), P4 Starlink (100 mégabits, 40 millisecondes, gigue marquée).</w:t>
+      </w:r>
+    </w:p>
+    <w:p>
+      <w:pPr>
+        <w:spacing w:after="140" w:before="0" w:line="360"/>
         <w:ind w:firstLine="709"/>
         <w:jc w:val="both"/>
       </w:pPr>
@@ -1468,7 +1313,26 @@
           <w:sz w:val="24"/>
           <w:szCs w:val="24"/>
         </w:rPr>
-        <w:t xml:space="preserve">, suit le même déroulé : trente secondes de calme pour mesurer le repos, cent vingt secondes de charge saturante, trente secondes de récupération. Puis </w:t>
+        <w:t xml:space="preserve">, dure trois minutes et suit toujours le même déroulé : 30 secondes de calme (mesure du repos), 120 secondes de charge (un téléchargement massif sature le lien, les petites sondes continuent), 30 secondes de récupération.</w:t>
+      </w:r>
+    </w:p>
+    <w:p>
+      <w:pPr>
+        <w:spacing w:after="140" w:before="0" w:line="360"/>
+        <w:ind w:firstLine="709"/>
+        <w:jc w:val="both"/>
+      </w:pPr>
+      <w:r>
+        <w:rPr>
+          <w:rFonts w:ascii="Times New Roman" w:cs="Times New Roman" w:eastAsia="Times New Roman" w:hAnsi="Times New Roman"/>
+          <w:b w:val="false"/>
+          <w:bCs w:val="false"/>
+          <w:i w:val="false"/>
+          <w:iCs w:val="false"/>
+          <w:sz w:val="24"/>
+          <w:szCs w:val="24"/>
+        </w:rPr>
+        <w:t xml:space="preserve">Puis </w:t>
       </w:r>
       <w:r>
         <w:rPr>
@@ -1492,7 +1356,7 @@
           <w:sz w:val="24"/>
           <w:szCs w:val="24"/>
         </w:rPr>
-        <w:t xml:space="preserve">, de G0 à G7, vérifient l'événement : cible joignable, charge réellement établie, latence physiquement plausible, débit cohérent avec le profil, aucune ligne dupliquée, repos stable, machine non saturée.</w:t>
+        <w:t xml:space="preserve"> (huit vérifications automatiques, G0 à G7) contrôlent l'essai : la cible répond-elle ? la charge a-t-elle vraiment eu lieu ? la latence est-elle physiquement possible ? le débit est-il cohérent avec le profil ? et quatre autres contrôles du même genre.</w:t>
       </w:r>
     </w:p>
     <w:p>
@@ -1500,7 +1364,7 @@
         <w:pBdr>
           <w:left w:val="single" w:color="9DB4CE" w:sz="6"/>
         </w:pBdr>
-        <w:spacing w:after="160" w:before="80" w:line="340"/>
+        <w:spacing w:after="180" w:before="80" w:line="340"/>
         <w:ind w:left="850" w:right="454"/>
         <w:jc w:val="both"/>
       </w:pPr>
@@ -1510,67 +1374,8 @@
           <w:sz w:val="23"/>
           <w:szCs w:val="23"/>
         </w:rPr>
-        <w:t xml:space="preserve">Un événement qui échoue une porte majeure part en quarantaine : sa ligne est conservée, comptée, mais exclue des résultats. Sur 286 lignes mesurées, 83 sont valides et 154 mises en quarantaine : le compte est publié tel quel, il fait partie des résultats. Rien n'est caché.</w:t>
-      </w:r>
-    </w:p>
-    <w:p>
-      <w:pPr>
-        <w:spacing w:after="120" w:before="0" w:line="360"/>
-        <w:ind w:firstLine="709"/>
-        <w:jc w:val="both"/>
-      </w:pPr>
-      <w:r>
-        <w:rPr>
-          <w:rFonts w:ascii="Times New Roman" w:cs="Times New Roman" w:eastAsia="Times New Roman" w:hAnsi="Times New Roman"/>
-          <w:b w:val="false"/>
-          <w:bCs w:val="false"/>
-          <w:i w:val="false"/>
-          <w:iCs w:val="false"/>
-          <w:sz w:val="24"/>
-          <w:szCs w:val="24"/>
-        </w:rPr>
-        <w:t xml:space="preserve">Ce ratio assume un choix : des portes larges auraient rempli les archives et affaibli les conclusions. </w:t>
-      </w:r>
-      <w:r>
-        <w:rPr>
-          <w:rFonts w:ascii="Times New Roman" w:cs="Times New Roman" w:eastAsia="Times New Roman" w:hAnsi="Times New Roman"/>
-          <w:b/>
-          <w:bCs/>
-          <w:i w:val="false"/>
-          <w:iCs w:val="false"/>
-          <w:sz w:val="24"/>
-          <w:szCs w:val="24"/>
-        </w:rPr>
-        <w:t xml:space="preserve">Mieux vaut peu de lignes sûres que beaucoup de lignes douteuses</w:t>
-      </w:r>
-      <w:r>
-        <w:rPr>
-          <w:rFonts w:ascii="Times New Roman" w:cs="Times New Roman" w:eastAsia="Times New Roman" w:hAnsi="Times New Roman"/>
-          <w:b w:val="false"/>
-          <w:bCs w:val="false"/>
-          <w:i w:val="false"/>
-          <w:iCs w:val="false"/>
-          <w:sz w:val="24"/>
-          <w:szCs w:val="24"/>
-        </w:rPr>
-        <w:t xml:space="preserve">.</w:t>
-      </w:r>
-    </w:p>
-    <w:p>
-      <w:pPr>
-        <w:spacing w:after="200" w:before="160" w:line="360"/>
-        <w:ind w:left="454"/>
-        <w:jc w:val="both"/>
-      </w:pPr>
-      <w:r>
-        <w:rPr>
-          <w:rFonts w:ascii="Times New Roman" w:cs="Times New Roman" w:eastAsia="Times New Roman" w:hAnsi="Times New Roman"/>
-          <w:i/>
-          <w:iCs/>
-          <w:sz w:val="24"/>
-          <w:szCs w:val="24"/>
-        </w:rPr>
-        <w:t xml:space="preserve">Les portes garantissent la qualité de chaque mesure. Reste à savoir ce que l'on mesure, et ce que ça a donné : c'est la section suivante.</w:t>
+        <w:t xml:space="preserve">Le résultat de ces portes est impitoyable et public : sur 286 lignes mesurées, 83 ont passé toutes les portes, 154 ont échoué au moins une porte majeure et sont « en quarantaine » (conservées mais exclues des conclusions). Le mémoire publie ce ratio tel quel.
+Pourquoi tant d'échecs ? Parce que les portes ont été durcies pendant la mise au point : chaque durcissement rejetait en bloc les essais anciens. Des portes larges auraient rempli les archives et affaibli les conclusions : mieux vaut peu de lignes sûres.</w:t>
       </w:r>
     </w:p>
     <w:p>
@@ -1579,7 +1384,7 @@
           <w:top w:val="single" w:color="808080" w:sz="4"/>
           <w:bottom w:val="single" w:color="808080" w:sz="4"/>
         </w:pBdr>
-        <w:spacing w:after="240" w:before="200" w:line="340"/>
+        <w:spacing w:after="260" w:before="220" w:line="340"/>
         <w:ind w:left="454" w:right="454"/>
       </w:pPr>
       <w:r>
@@ -1602,7 +1407,23 @@
           <w:sz w:val="23"/>
           <w:szCs w:val="23"/>
         </w:rPr>
-        <w:t xml:space="preserve">Classe les quatre profils du plus rapide au plus lent en réponse. Sous chacun, écris son pire ennemi en deux mots : distance, débit, gigue ou perte.</w:t>
+        <w:t xml:space="preserve">Classe les quatre profils du plus rapide au plus lent à répondre. Sous chacun, son pire ennemi en deux mots : distance, débit, gigue ou perte.</w:t>
+      </w:r>
+    </w:p>
+    <w:p>
+      <w:pPr>
+        <w:spacing w:after="160" w:line="340"/>
+        <w:ind w:left="454"/>
+      </w:pPr>
+      <w:r>
+        <w:rPr>
+          <w:rFonts w:ascii="Times New Roman" w:cs="Times New Roman" w:eastAsia="Times New Roman" w:hAnsi="Times New Roman"/>
+          <w:i/>
+          <w:iCs/>
+          <w:sz w:val="23"/>
+          <w:szCs w:val="23"/>
+        </w:rPr>
+        <w:t xml:space="preserve">Le banc produit des essais propres. Question suivante : que mesure-t-on exactement dans ces essais, et qu'ont-ils donné ?</w:t>
       </w:r>
     </w:p>
     <w:p>
@@ -1617,30 +1438,46 @@
           <w:sz w:val="32"/>
           <w:szCs w:val="32"/>
         </w:rPr>
-        <w:t xml:space="preserve">5. Les chiffres : soixante contre quatre-vingt-dix-huit</w:t>
-      </w:r>
-    </w:p>
-    <w:p>
-      <w:pPr>
-        <w:spacing w:after="120" w:before="0" w:line="360"/>
-        <w:jc w:val="both"/>
-      </w:pPr>
-      <w:r>
-        <w:rPr>
-          <w:rFonts w:ascii="Times New Roman" w:cs="Times New Roman" w:eastAsia="Times New Roman" w:hAnsi="Times New Roman"/>
-          <w:b w:val="false"/>
-          <w:bCs w:val="false"/>
-          <w:i w:val="false"/>
-          <w:iCs w:val="false"/>
-          <w:sz w:val="24"/>
-          <w:szCs w:val="24"/>
-        </w:rPr>
-        <w:t xml:space="preserve">Cinq indicateurs, une phrase chacun.</w:t>
-      </w:r>
-    </w:p>
-    <w:p>
-      <w:pPr>
-        <w:spacing w:after="120" w:before="0" w:line="360"/>
+        <w:t xml:space="preserve">5. Les chiffres : ce qui a été mesuré, et ce que ça dit</w:t>
+      </w:r>
+    </w:p>
+    <w:p>
+      <w:pPr>
+        <w:spacing w:after="160" w:line="340"/>
+        <w:ind w:left="454"/>
+      </w:pPr>
+      <w:r>
+        <w:rPr>
+          <w:rFonts w:ascii="Times New Roman" w:cs="Times New Roman" w:eastAsia="Times New Roman" w:hAnsi="Times New Roman"/>
+          <w:i/>
+          <w:iCs/>
+          <w:sz w:val="23"/>
+          <w:szCs w:val="23"/>
+        </w:rPr>
+        <w:t xml:space="preserve">Pourquoi cette section ? Parce que c'est le résultat du mémoire. Tout ce qui précède sert à rendre ces chiffres crédibles.</w:t>
+      </w:r>
+    </w:p>
+    <w:p>
+      <w:pPr>
+        <w:spacing w:after="140" w:before="0" w:line="360"/>
+        <w:jc w:val="both"/>
+      </w:pPr>
+      <w:r>
+        <w:rPr>
+          <w:rFonts w:ascii="Times New Roman" w:cs="Times New Roman" w:eastAsia="Times New Roman" w:hAnsi="Times New Roman"/>
+          <w:b w:val="false"/>
+          <w:bCs w:val="false"/>
+          <w:i w:val="false"/>
+          <w:iCs w:val="false"/>
+          <w:sz w:val="24"/>
+          <w:szCs w:val="24"/>
+        </w:rPr>
+        <w:t xml:space="preserve">Cinq mesures, une phrase chacune.</w:t>
+      </w:r>
+    </w:p>
+    <w:p>
+      <w:pPr>
+        <w:spacing w:after="140" w:before="0" w:line="360"/>
         <w:ind w:firstLine="709"/>
         <w:jc w:val="both"/>
       </w:pPr>
@@ -1678,7 +1515,7 @@
           <w:sz w:val="24"/>
           <w:szCs w:val="24"/>
         </w:rPr>
-        <w:t xml:space="preserve"> (p50) est le temps de réponse typique. Le </w:t>
+        <w:t xml:space="preserve"> (la valeur du milieu : la moitié des cas font mieux, l'autre moitié moins bien) donne le cas typique. Le </w:t>
       </w:r>
       <w:r>
         <w:rPr>
@@ -1702,7 +1539,26 @@
           <w:sz w:val="24"/>
           <w:szCs w:val="24"/>
         </w:rPr>
-        <w:t xml:space="preserve"> est le temps que subissent les cas défavorables : c'est lui qui décide de la sensation de blocage. Le </w:t>
+        <w:t xml:space="preserve"> (le temps que subissent les 5 % des cas les plus lents) donne les cas pénibles : c'est lui qui décide de la sensation de blocage.</w:t>
+      </w:r>
+    </w:p>
+    <w:p>
+      <w:pPr>
+        <w:spacing w:after="140" w:before="0" w:line="360"/>
+        <w:ind w:firstLine="709"/>
+        <w:jc w:val="both"/>
+      </w:pPr>
+      <w:r>
+        <w:rPr>
+          <w:rFonts w:ascii="Times New Roman" w:cs="Times New Roman" w:eastAsia="Times New Roman" w:hAnsi="Times New Roman"/>
+          <w:b w:val="false"/>
+          <w:bCs w:val="false"/>
+          <w:i w:val="false"/>
+          <w:iCs w:val="false"/>
+          <w:sz w:val="24"/>
+          <w:szCs w:val="24"/>
+        </w:rPr>
+        <w:t xml:space="preserve">Le </w:t>
       </w:r>
       <w:r>
         <w:rPr>
@@ -1726,7 +1582,7 @@
           <w:sz w:val="24"/>
           <w:szCs w:val="24"/>
         </w:rPr>
-        <w:t xml:space="preserve"> compte la part des petites requêtes arrivées sous un seuil fixé, ici 220 millisecondes sur le profil 4G : la traduction directe d'un engagement de service. Le </w:t>
+        <w:t xml:space="preserve"> (le pourcentage de petites requêtes arrivées sous un seuil fixé, ici 220 millisecondes) traduit un engagement de service : « 95 % des consultations répondent en moins de 220 ms ». Le </w:t>
       </w:r>
       <w:r>
         <w:rPr>
@@ -1750,7 +1606,26 @@
           <w:sz w:val="24"/>
           <w:szCs w:val="24"/>
         </w:rPr>
-        <w:t xml:space="preserve">, l'écart entre p95 et médiane, mesure la régularité : un écart faible, un lien prévisible. Le </w:t>
+        <w:t xml:space="preserve"> (l'écart entre p95 et médiane : grand écart = lien imprévisible) mesure la régularité.</w:t>
+      </w:r>
+    </w:p>
+    <w:p>
+      <w:pPr>
+        <w:spacing w:after="140" w:before="0" w:line="360"/>
+        <w:ind w:firstLine="709"/>
+        <w:jc w:val="both"/>
+      </w:pPr>
+      <w:r>
+        <w:rPr>
+          <w:rFonts w:ascii="Times New Roman" w:cs="Times New Roman" w:eastAsia="Times New Roman" w:hAnsi="Times New Roman"/>
+          <w:b w:val="false"/>
+          <w:bCs w:val="false"/>
+          <w:i w:val="false"/>
+          <w:iCs w:val="false"/>
+          <w:sz w:val="24"/>
+          <w:szCs w:val="24"/>
+        </w:rPr>
+        <w:t xml:space="preserve">Enfin, le </w:t>
       </w:r>
       <w:r>
         <w:rPr>
@@ -1774,12 +1649,12 @@
           <w:sz w:val="24"/>
           <w:szCs w:val="24"/>
         </w:rPr>
-        <w:t xml:space="preserve"> applique au volume gaspillé les tarifs réels des opérateurs.</w:t>
-      </w:r>
-    </w:p>
-    <w:p>
-      <w:pPr>
-        <w:spacing w:after="120" w:before="0" w:line="360"/>
+        <w:t xml:space="preserve"> convertit le gaspillage en argent réel : les octets jetés puis renvoyés, au tarif public du forfait.</w:t>
+      </w:r>
+    </w:p>
+    <w:p>
+      <w:pPr>
+        <w:spacing w:after="140" w:before="0" w:line="360"/>
         <w:ind w:firstLine="709"/>
         <w:jc w:val="both"/>
       </w:pPr>
@@ -1793,74 +1668,25 @@
           <w:sz w:val="24"/>
           <w:szCs w:val="24"/>
         </w:rPr>
-        <w:t xml:space="preserve">Le résultat central du mémoire, sur le profil 4G, échéance à 220 millisecondes, transfert massif en cours :</w:t>
-      </w:r>
-    </w:p>
-    <w:p>
-      <w:pPr>
-        <w:spacing w:after="120" w:before="0" w:line="360"/>
-        <w:ind w:firstLine="709"/>
-        <w:jc w:val="both"/>
-      </w:pPr>
-      <w:r>
-        <w:rPr>
-          <w:rFonts w:ascii="Times New Roman" w:cs="Times New Roman" w:eastAsia="Times New Roman" w:hAnsi="Times New Roman"/>
-          <w:b w:val="false"/>
-          <w:bCs w:val="false"/>
-          <w:i w:val="false"/>
-          <w:iCs w:val="false"/>
-          <w:sz w:val="24"/>
-          <w:szCs w:val="24"/>
-        </w:rPr>
-        <w:t xml:space="preserve">La file simple, pfifo_fast avec BBR, ne sauve que </w:t>
-      </w:r>
-      <w:r>
-        <w:rPr>
-          <w:rFonts w:ascii="Times New Roman" w:cs="Times New Roman" w:eastAsia="Times New Roman" w:hAnsi="Times New Roman"/>
-          <w:b/>
-          <w:bCs/>
-          <w:i w:val="false"/>
-          <w:iCs w:val="false"/>
-          <w:sz w:val="24"/>
-          <w:szCs w:val="24"/>
-        </w:rPr>
-        <w:t xml:space="preserve">60 %</w:t>
-      </w:r>
-      <w:r>
-        <w:rPr>
-          <w:rFonts w:ascii="Times New Roman" w:cs="Times New Roman" w:eastAsia="Times New Roman" w:hAnsi="Times New Roman"/>
-          <w:b w:val="false"/>
-          <w:bCs w:val="false"/>
-          <w:i w:val="false"/>
-          <w:iCs w:val="false"/>
-          <w:sz w:val="24"/>
-          <w:szCs w:val="24"/>
-        </w:rPr>
-        <w:t xml:space="preserve"> des requêtes à l'heure. Les disciplines actives en sauvent </w:t>
-      </w:r>
-      <w:r>
-        <w:rPr>
-          <w:rFonts w:ascii="Times New Roman" w:cs="Times New Roman" w:eastAsia="Times New Roman" w:hAnsi="Times New Roman"/>
-          <w:b/>
-          <w:bCs/>
-          <w:i w:val="false"/>
-          <w:iCs w:val="false"/>
-          <w:sz w:val="24"/>
-          <w:szCs w:val="24"/>
-        </w:rPr>
-        <w:t xml:space="preserve">96 à 98 %</w:t>
-      </w:r>
-      <w:r>
-        <w:rPr>
-          <w:rFonts w:ascii="Times New Roman" w:cs="Times New Roman" w:eastAsia="Times New Roman" w:hAnsi="Times New Roman"/>
-          <w:b w:val="false"/>
-          <w:bCs w:val="false"/>
-          <w:i w:val="false"/>
-          <w:iCs w:val="false"/>
-          <w:sz w:val="24"/>
-          <w:szCs w:val="24"/>
-        </w:rPr>
-        <w:t xml:space="preserve"> : fq_codel 96,2 %, CAKE 98,1 %. La régularité suit : cinquante-sept millisecondes d'écart sous la file simple, environ treize sous les disciplines actives.</w:t>
+        <w:t xml:space="preserve">Le résultat central, profil 4G, transfert massif en cours, échéance 220 millisecondes :</w:t>
+      </w:r>
+    </w:p>
+    <w:p>
+      <w:pPr>
+        <w:pBdr>
+          <w:left w:val="single" w:color="9DB4CE" w:sz="6"/>
+        </w:pBdr>
+        <w:spacing w:after="180" w:before="80" w:line="340"/>
+        <w:ind w:left="850" w:right="454"/>
+        <w:jc w:val="both"/>
+      </w:pPr>
+      <w:r>
+        <w:rPr>
+          <w:rFonts w:ascii="Times New Roman" w:cs="Times New Roman" w:eastAsia="Times New Roman" w:hAnsi="Times New Roman"/>
+          <w:sz w:val="23"/>
+          <w:szCs w:val="23"/>
+        </w:rPr>
+        <w:t xml:space="preserve">Avec la file simple (pfifo_fast) et l'émetteur BBR : 60 % des petites requêtes arrivent à l'heure. Avec fq_codel : 96 %. Avec CAKE : 98 %. Et le débit du téléchargement massif ? Identique partout : entre 18,2 et 19,5 mégabits par seconde sur un lien de 20. La protection ne coûte pas de vitesse ; elle coûte quelques paquets jetés volontairement, payés en octets renvoyés.</w:t>
       </w:r>
     </w:p>
     <w:p>
@@ -1871,7 +1697,7 @@
       <w:r>
         <w:drawing>
           <wp:inline distT="0" distB="0" distL="0" distR="0">
-            <wp:extent cx="5334000" cy="2724150"/>
+            <wp:extent cx="4848225" cy="2476500"/>
             <wp:effectExtent t="0" r="0" b="0" l="0"/>
             <wp:docPr id="1" name="" descr="" title=""/>
             <wp:cNvGraphicFramePr>
@@ -1896,7 +1722,7 @@
                   <pic:spPr bwMode="auto">
                     <a:xfrm>
                       <a:off x="0" y="0"/>
-                      <a:ext cx="5334000" cy="2724150"/>
+                      <a:ext cx="4848225" cy="2476500"/>
                     </a:xfrm>
                     <a:prstGeom prst="rect">
                       <a:avLst/>
@@ -1922,12 +1748,12 @@
           <w:sz w:val="22"/>
           <w:szCs w:val="22"/>
         </w:rPr>
-        <w:t xml:space="preserve">Le résultat central : respect de l'échéance à 220 ms sous charge, profil 4G. La file simple s'effondre, les disciplines actives tiennent.</w:t>
-      </w:r>
-    </w:p>
-    <w:p>
-      <w:pPr>
-        <w:spacing w:after="120" w:before="0" w:line="360"/>
+        <w:t xml:space="preserve">Le résultat central : respect de l'échéance à 220 ms sous charge, profil 4G. La file simple s'effondre, les actives tiennent.</w:t>
+      </w:r>
+    </w:p>
+    <w:p>
+      <w:pPr>
+        <w:spacing w:after="140" w:before="0" w:line="360"/>
         <w:ind w:firstLine="709"/>
         <w:jc w:val="both"/>
       </w:pPr>
@@ -1941,54 +1767,12 @@
           <w:sz w:val="24"/>
           <w:szCs w:val="24"/>
         </w:rPr>
-        <w:t xml:space="preserve">Et le débit, dans tout ça ? Il est </w:t>
-      </w:r>
-      <w:r>
-        <w:rPr>
-          <w:rFonts w:ascii="Times New Roman" w:cs="Times New Roman" w:eastAsia="Times New Roman" w:hAnsi="Times New Roman"/>
-          <w:b/>
-          <w:bCs/>
-          <w:i w:val="false"/>
-          <w:iCs w:val="false"/>
-          <w:sz w:val="24"/>
-          <w:szCs w:val="24"/>
-        </w:rPr>
-        <w:t xml:space="preserve">préservé</w:t>
-      </w:r>
-      <w:r>
-        <w:rPr>
-          <w:rFonts w:ascii="Times New Roman" w:cs="Times New Roman" w:eastAsia="Times New Roman" w:hAnsi="Times New Roman"/>
-          <w:b w:val="false"/>
-          <w:bCs w:val="false"/>
-          <w:i w:val="false"/>
-          <w:iCs w:val="false"/>
-          <w:sz w:val="24"/>
-          <w:szCs w:val="24"/>
-        </w:rPr>
-        <w:t xml:space="preserve"> : entre 18,2 et 19,5 mégabits par seconde sur un profil de 20. La protection de la latence ne se paie pas en débit ; elle se paie en quelques paquets écartés, chiffrés en ariary.</w:t>
-      </w:r>
-    </w:p>
-    <w:p>
-      <w:pPr>
-        <w:pBdr>
-          <w:left w:val="single" w:color="9DB4CE" w:sz="6"/>
-        </w:pBdr>
-        <w:spacing w:after="160" w:before="80" w:line="340"/>
-        <w:ind w:left="850" w:right="454"/>
-        <w:jc w:val="both"/>
-      </w:pPr>
-      <w:r>
-        <w:rPr>
-          <w:rFonts w:ascii="Times New Roman" w:cs="Times New Roman" w:eastAsia="Times New Roman" w:hAnsi="Times New Roman"/>
-          <w:sz w:val="23"/>
-          <w:szCs w:val="23"/>
-        </w:rPr>
-        <w:t xml:space="preserve">Sur la voix, le score R du modèle E de l'UIT confirme la hiérarchie : environ 85 sur la 4G au repos, autour de 71 sur le VSAT chargé, une barre qu'aucun réglage local ne peut relever. Sur le coût : quelques centaines d'ariary par heure de charge sur le lien 4G au palier mensuel, la fibre étant dix fois moins chère au gigaoctet.</w:t>
-      </w:r>
-    </w:p>
-    <w:p>
-      <w:pPr>
-        <w:spacing w:after="120" w:before="0" w:line="360"/>
+        <w:t xml:space="preserve">Pourquoi cet écart est-il massif et pas du bruit ? Sur les vagues antérieures, la même hiérarchie revient : onze répétitions de la file simple, sept de fq_codel, six de CAKE, toutes concordantes.</w:t>
+      </w:r>
+    </w:p>
+    <w:p>
+      <w:pPr>
+        <w:spacing w:after="140" w:before="0" w:line="360"/>
         <w:ind w:firstLine="709"/>
         <w:jc w:val="both"/>
       </w:pPr>
@@ -2002,48 +1786,74 @@
           <w:sz w:val="24"/>
           <w:szCs w:val="24"/>
         </w:rPr>
-        <w:t xml:space="preserve">Trois des six cellules de la campagne finale, celles avec CUBIC, sont en quarantaine : pas pour leur latence, excellente, mais parce que CUBIC s'effondre sur la perte de base du lien 4G et ne tient pas la charge prévue. </w:t>
-      </w:r>
-      <w:r>
-        <w:rPr>
-          <w:rFonts w:ascii="Times New Roman" w:cs="Times New Roman" w:eastAsia="Times New Roman" w:hAnsi="Times New Roman"/>
-          <w:b/>
-          <w:bCs/>
-          <w:i w:val="false"/>
-          <w:iCs w:val="false"/>
-          <w:sz w:val="24"/>
-          <w:szCs w:val="24"/>
-        </w:rPr>
-        <w:t xml:space="preserve">Sur un lien cellulaire chargé, CUBIC ne tient pas la charge, quel que soit le soin apporté à la file</w:t>
-      </w:r>
-      <w:r>
-        <w:rPr>
-          <w:rFonts w:ascii="Times New Roman" w:cs="Times New Roman" w:eastAsia="Times New Roman" w:hAnsi="Times New Roman"/>
-          <w:b w:val="false"/>
-          <w:bCs w:val="false"/>
-          <w:i w:val="false"/>
-          <w:iCs w:val="false"/>
-          <w:sz w:val="24"/>
-          <w:szCs w:val="24"/>
-        </w:rPr>
-        <w:t xml:space="preserve"> : c'est en soi un résultat.</w:t>
-      </w:r>
-    </w:p>
-    <w:p>
-      <w:pPr>
-        <w:spacing w:after="200" w:before="160" w:line="360"/>
-        <w:ind w:left="454"/>
-        <w:jc w:val="both"/>
-      </w:pPr>
-      <w:r>
-        <w:rPr>
-          <w:rFonts w:ascii="Times New Roman" w:cs="Times New Roman" w:eastAsia="Times New Roman" w:hAnsi="Times New Roman"/>
-          <w:i/>
-          <w:iCs/>
-          <w:sz w:val="24"/>
-          <w:szCs w:val="24"/>
-        </w:rPr>
-        <w:t xml:space="preserve">Ces chiffres, d'où sortent-ils exactement ? Sont-ils vérifiables, ou la parole de l'auteur ? C'est toute la section suivante.</w:t>
+        <w:t xml:space="preserve">La régularité suit le même ordre : écart de 57 millisecondes sous la file simple, environ 13 sous les actives. </w:t>
+      </w:r>
+      <w:r>
+        <w:rPr>
+          <w:rFonts w:ascii="Times New Roman" w:cs="Times New Roman" w:eastAsia="Times New Roman" w:hAnsi="Times New Roman"/>
+          <w:b/>
+          <w:bCs/>
+          <w:i w:val="false"/>
+          <w:iCs w:val="false"/>
+          <w:sz w:val="24"/>
+          <w:szCs w:val="24"/>
+        </w:rPr>
+        <w:t xml:space="preserve">Un lien régulier, c'est un lien qu'on peut surveiller</w:t>
+      </w:r>
+      <w:r>
+        <w:rPr>
+          <w:rFonts w:ascii="Times New Roman" w:cs="Times New Roman" w:eastAsia="Times New Roman" w:hAnsi="Times New Roman"/>
+          <w:b w:val="false"/>
+          <w:bCs w:val="false"/>
+          <w:i w:val="false"/>
+          <w:iCs w:val="false"/>
+          <w:sz w:val="24"/>
+          <w:szCs w:val="24"/>
+        </w:rPr>
+        <w:t xml:space="preserve"> : une alerte de latence y veut dire quelque chose.</w:t>
+      </w:r>
+    </w:p>
+    <w:p>
+      <w:pPr>
+        <w:spacing w:after="140" w:before="0" w:line="360"/>
+        <w:ind w:firstLine="709"/>
+        <w:jc w:val="both"/>
+      </w:pPr>
+      <w:r>
+        <w:rPr>
+          <w:rFonts w:ascii="Times New Roman" w:cs="Times New Roman" w:eastAsia="Times New Roman" w:hAnsi="Times New Roman"/>
+          <w:b w:val="false"/>
+          <w:bCs w:val="false"/>
+          <w:i w:val="false"/>
+          <w:iCs w:val="false"/>
+          <w:sz w:val="24"/>
+          <w:szCs w:val="24"/>
+        </w:rPr>
+        <w:t xml:space="preserve">Un résultat inattendu, à connaître : les essais avec CUBIC, l'émetteur prudent, ont été mis en quarantaine. Pas pour leur latence : excellente. Parce que sur un lien 4G qui perd naturellement 0,5 % de ses paquets, CUBIC prend chaque perte pour un accident de sa faute, ralentit, et ne tient plus la charge prévue. </w:t>
+      </w:r>
+      <w:r>
+        <w:rPr>
+          <w:rFonts w:ascii="Times New Roman" w:cs="Times New Roman" w:eastAsia="Times New Roman" w:hAnsi="Times New Roman"/>
+          <w:b/>
+          <w:bCs/>
+          <w:i w:val="false"/>
+          <w:iCs w:val="false"/>
+          <w:sz w:val="24"/>
+          <w:szCs w:val="24"/>
+        </w:rPr>
+        <w:t xml:space="preserve">Sur un lien cellulaire, le choix de l'émetteur pèse autant que celui de la file</w:t>
+      </w:r>
+      <w:r>
+        <w:rPr>
+          <w:rFonts w:ascii="Times New Roman" w:cs="Times New Roman" w:eastAsia="Times New Roman" w:hAnsi="Times New Roman"/>
+          <w:b w:val="false"/>
+          <w:bCs w:val="false"/>
+          <w:i w:val="false"/>
+          <w:iCs w:val="false"/>
+          <w:sz w:val="24"/>
+          <w:szCs w:val="24"/>
+        </w:rPr>
+        <w:t xml:space="preserve">.</w:t>
       </w:r>
     </w:p>
     <w:p>
@@ -2052,7 +1862,7 @@
           <w:top w:val="single" w:color="808080" w:sz="4"/>
           <w:bottom w:val="single" w:color="808080" w:sz="4"/>
         </w:pBdr>
-        <w:spacing w:after="240" w:before="200" w:line="340"/>
+        <w:spacing w:after="260" w:before="220" w:line="340"/>
         <w:ind w:left="454" w:right="454"/>
       </w:pPr>
       <w:r>
@@ -2075,7 +1885,23 @@
           <w:sz w:val="23"/>
           <w:szCs w:val="23"/>
         </w:rPr>
-        <w:t xml:space="preserve">Trace deux barres côte à côte : pfifo à 60 %, CAKE à 98 % de requêtes à l'heure. Sous les barres, écris en une phrase le mécanisme qui les sépare.</w:t>
+        <w:t xml:space="preserve">Trace deux barres : pfifo à 60 %, CAKE à 98 % de requêtes à l'heure. Dessous, le mécanisme en une phrase.</w:t>
+      </w:r>
+    </w:p>
+    <w:p>
+      <w:pPr>
+        <w:spacing w:after="160" w:line="340"/>
+        <w:ind w:left="454"/>
+      </w:pPr>
+      <w:r>
+        <w:rPr>
+          <w:rFonts w:ascii="Times New Roman" w:cs="Times New Roman" w:eastAsia="Times New Roman" w:hAnsi="Times New Roman"/>
+          <w:i/>
+          <w:iCs/>
+          <w:sz w:val="23"/>
+          <w:szCs w:val="23"/>
+        </w:rPr>
+        <w:t xml:space="preserve">Ces chiffres seraient de la parole d'auteur s'ils n'étaient pas vérifiables. Question finale avant l'outil : qui peut les contrôler ?</w:t>
       </w:r>
     </w:p>
     <w:p>
@@ -2090,12 +1916,28 @@
           <w:sz w:val="32"/>
           <w:szCs w:val="32"/>
         </w:rPr>
-        <w:t xml:space="preserve">6. La preuve : gelée et vérifiable</w:t>
-      </w:r>
-    </w:p>
-    <w:p>
-      <w:pPr>
-        <w:spacing w:after="120" w:before="0" w:line="360"/>
+        <w:t xml:space="preserve">6. La preuve : des chiffres que personne ne peut modifier</w:t>
+      </w:r>
+    </w:p>
+    <w:p>
+      <w:pPr>
+        <w:spacing w:after="160" w:line="340"/>
+        <w:ind w:left="454"/>
+      </w:pPr>
+      <w:r>
+        <w:rPr>
+          <w:rFonts w:ascii="Times New Roman" w:cs="Times New Roman" w:eastAsia="Times New Roman" w:hAnsi="Times New Roman"/>
+          <w:i/>
+          <w:iCs/>
+          <w:sz w:val="23"/>
+          <w:szCs w:val="23"/>
+        </w:rPr>
+        <w:t xml:space="preserve">Pourquoi cette section ? Parce qu'un jury, un directeur, un collègue demandera : « pourquoi vous croire ? ». La réponse est une chaîne, pas un argument.</w:t>
+      </w:r>
+    </w:p>
+    <w:p>
+      <w:pPr>
+        <w:spacing w:after="140" w:before="0" w:line="360"/>
         <w:ind w:firstLine="709"/>
         <w:jc w:val="both"/>
       </w:pPr>
@@ -2109,7 +1951,7 @@
           <w:sz w:val="24"/>
           <w:szCs w:val="24"/>
         </w:rPr>
-        <w:t xml:space="preserve">Chaque campagne écrit ses lignes dans un fichier </w:t>
+        <w:t xml:space="preserve">Chaque essai écrit une ligne dans un fichier </w:t>
       </w:r>
       <w:r>
         <w:rPr>
@@ -2133,7 +1975,7 @@
           <w:sz w:val="24"/>
           <w:szCs w:val="24"/>
         </w:rPr>
-        <w:t xml:space="preserve">, un tableau à colonnes fixes, une ligne par événement. Puis le fichier est </w:t>
+        <w:t xml:space="preserve"> (un tableau dans un fichier texte : une ligne par mesure, des colonnes fixes). Ensuite le fichier est </w:t>
       </w:r>
       <w:r>
         <w:rPr>
@@ -2157,7 +1999,26 @@
           <w:sz w:val="24"/>
           <w:szCs w:val="24"/>
         </w:rPr>
-        <w:t xml:space="preserve"> : il ne bouge plus. Un </w:t>
+        <w:t xml:space="preserve"> : il ne bouge plus.</w:t>
+      </w:r>
+    </w:p>
+    <w:p>
+      <w:pPr>
+        <w:spacing w:after="140" w:before="0" w:line="360"/>
+        <w:ind w:firstLine="709"/>
+        <w:jc w:val="both"/>
+      </w:pPr>
+      <w:r>
+        <w:rPr>
+          <w:rFonts w:ascii="Times New Roman" w:cs="Times New Roman" w:eastAsia="Times New Roman" w:hAnsi="Times New Roman"/>
+          <w:b w:val="false"/>
+          <w:bCs w:val="false"/>
+          <w:i w:val="false"/>
+          <w:iCs w:val="false"/>
+          <w:sz w:val="24"/>
+          <w:szCs w:val="24"/>
+        </w:rPr>
+        <w:t xml:space="preserve">Et un </w:t>
       </w:r>
       <w:r>
         <w:rPr>
@@ -2181,7 +2042,7 @@
           <w:sz w:val="24"/>
           <w:szCs w:val="24"/>
         </w:rPr>
-        <w:t xml:space="preserve"> enregistre l'empreinte </w:t>
+        <w:t xml:space="preserve"> (la liste officielle des fichiers du run) enregistre pour chaque fichier son </w:t>
       </w:r>
       <w:r>
         <w:rPr>
@@ -2205,12 +2066,12 @@
           <w:sz w:val="24"/>
           <w:szCs w:val="24"/>
         </w:rPr>
-        <w:t xml:space="preserve"> de chaque fichier : une somme unique qui change au moindre octet modifié.</w:t>
-      </w:r>
-    </w:p>
-    <w:p>
-      <w:pPr>
-        <w:spacing w:after="120" w:before="0" w:line="360"/>
+        <w:t xml:space="preserve"> (une empreinte digitale numérique : une suite de caractères unique, calculée à partir du fichier entier, qui change si un seul octet change).</w:t>
+      </w:r>
+    </w:p>
+    <w:p>
+      <w:pPr>
+        <w:spacing w:after="140" w:before="0" w:line="360"/>
         <w:ind w:firstLine="709"/>
         <w:jc w:val="both"/>
       </w:pPr>
@@ -2248,31 +2109,31 @@
           <w:sz w:val="24"/>
           <w:szCs w:val="24"/>
         </w:rPr>
-        <w:t xml:space="preserve">, recalcule ces sommes et signale toute divergence. Les figures du mémoire se régénèrent uniquement depuis ces fichiers gelés : </w:t>
-      </w:r>
-      <w:r>
-        <w:rPr>
-          <w:rFonts w:ascii="Times New Roman" w:cs="Times New Roman" w:eastAsia="Times New Roman" w:hAnsi="Times New Roman"/>
-          <w:b/>
-          <w:bCs/>
-          <w:i w:val="false"/>
-          <w:iCs w:val="false"/>
-          <w:sz w:val="24"/>
-          <w:szCs w:val="24"/>
-        </w:rPr>
-        <w:t xml:space="preserve">aucune valeur n'est saisie à la main</w:t>
-      </w:r>
-      <w:r>
-        <w:rPr>
-          <w:rFonts w:ascii="Times New Roman" w:cs="Times New Roman" w:eastAsia="Times New Roman" w:hAnsi="Times New Roman"/>
-          <w:b w:val="false"/>
-          <w:bCs w:val="false"/>
-          <w:i w:val="false"/>
-          <w:iCs w:val="false"/>
-          <w:sz w:val="24"/>
-          <w:szCs w:val="24"/>
-        </w:rPr>
-        <w:t xml:space="preserve">. Les lignes en quarantaine ne disparaissent pas : elles restent, comptées, avec leur raison d'exclusion.</w:t>
+        <w:t xml:space="preserve">, recalcule toutes les empreintes et signale tout écart. </w:t>
+      </w:r>
+      <w:r>
+        <w:rPr>
+          <w:rFonts w:ascii="Times New Roman" w:cs="Times New Roman" w:eastAsia="Times New Roman" w:hAnsi="Times New Roman"/>
+          <w:b/>
+          <w:bCs/>
+          <w:i w:val="false"/>
+          <w:iCs w:val="false"/>
+          <w:sz w:val="24"/>
+          <w:szCs w:val="24"/>
+        </w:rPr>
+        <w:t xml:space="preserve">Les figures du mémoire sont régénérées uniquement depuis ces fichiers gelés : aucune valeur n'est jamais tapée à la main</w:t>
+      </w:r>
+      <w:r>
+        <w:rPr>
+          <w:rFonts w:ascii="Times New Roman" w:cs="Times New Roman" w:eastAsia="Times New Roman" w:hAnsi="Times New Roman"/>
+          <w:b w:val="false"/>
+          <w:bCs w:val="false"/>
+          <w:i w:val="false"/>
+          <w:iCs w:val="false"/>
+          <w:sz w:val="24"/>
+          <w:szCs w:val="24"/>
+        </w:rPr>
+        <w:t xml:space="preserve">. Même les 154 lignes en quarantaine restent visibles, avec leur raison d'exclusion.</w:t>
       </w:r>
     </w:p>
     <w:p>
@@ -2280,7 +2141,7 @@
         <w:pBdr>
           <w:left w:val="single" w:color="9DB4CE" w:sz="6"/>
         </w:pBdr>
-        <w:spacing w:after="160" w:before="80" w:line="340"/>
+        <w:spacing w:after="180" w:before="80" w:line="340"/>
         <w:ind w:left="850" w:right="454"/>
         <w:jc w:val="both"/>
       </w:pPr>
@@ -2290,24 +2151,55 @@
           <w:sz w:val="23"/>
           <w:szCs w:val="23"/>
         </w:rPr>
-        <w:t xml:space="preserve">La chaîne complète d'un chiffre : la sonde mesure, l'événement franchit les huit portes, la ligne est écrite dans le CSV, le manifeste en prend l'empreinte, la figure se régénère depuis le fichier. Un lecteur disposant du dépôt peut tout recalculer : c'est la réponse à « qui peut vérifier ? ».</w:t>
-      </w:r>
-    </w:p>
-    <w:p>
-      <w:pPr>
-        <w:spacing w:after="200" w:before="160" w:line="360"/>
-        <w:ind w:left="454"/>
-        <w:jc w:val="both"/>
-      </w:pPr>
-      <w:r>
-        <w:rPr>
-          <w:rFonts w:ascii="Times New Roman" w:cs="Times New Roman" w:eastAsia="Times New Roman" w:hAnsi="Times New Roman"/>
+        <w:t xml:space="preserve">La chaîne complète d'un chiffre, de bout en bout : la sonde mesure ; l'événement franchit les huit portes ; la ligne s'écrit dans le CSV ; le manifeste prend l'empreinte du fichier ; la figure se régénère depuis le fichier. N'importe qui, avec le dépôt, peut tout recalculer. C'est la réponse à « qui peut vérifier ? ».</w:t>
+      </w:r>
+    </w:p>
+    <w:p>
+      <w:pPr>
+        <w:pBdr>
+          <w:top w:val="single" w:color="808080" w:sz="4"/>
+          <w:bottom w:val="single" w:color="808080" w:sz="4"/>
+        </w:pBdr>
+        <w:spacing w:after="260" w:before="220" w:line="340"/>
+        <w:ind w:left="454" w:right="454"/>
+      </w:pPr>
+      <w:r>
+        <w:rPr>
+          <w:rFonts w:ascii="Times New Roman" w:cs="Times New Roman" w:eastAsia="Times New Roman" w:hAnsi="Times New Roman"/>
+          <w:b/>
+          <w:bCs/>
           <w:i/>
           <w:iCs/>
-          <w:sz w:val="24"/>
-          <w:szCs w:val="24"/>
-        </w:rPr>
-        <w:t xml:space="preserve">Comprendre le problème, le remède, le banc et la preuve : le mémoire est maintenant entre tes mains. Reste à savoir t'en servir. La grande section suivante est un guide par gestes.</w:t>
+          <w:sz w:val="23"/>
+          <w:szCs w:val="23"/>
+        </w:rPr>
+        <w:t xml:space="preserve">À toi, 30 secondes, un crayon : </w:t>
+      </w:r>
+      <w:r>
+        <w:rPr>
+          <w:rFonts w:ascii="Times New Roman" w:cs="Times New Roman" w:eastAsia="Times New Roman" w:hAnsi="Times New Roman"/>
+          <w:i/>
+          <w:iCs/>
+          <w:sz w:val="23"/>
+          <w:szCs w:val="23"/>
+        </w:rPr>
+        <w:t xml:space="preserve">Écris la chaîne de confiance en quatre mots reliés par des flèches : mesure, gel, empreinte, vérification. C'est la colonne vertébrale du mémoire.</w:t>
+      </w:r>
+    </w:p>
+    <w:p>
+      <w:pPr>
+        <w:spacing w:after="160" w:line="340"/>
+        <w:ind w:left="454"/>
+      </w:pPr>
+      <w:r>
+        <w:rPr>
+          <w:rFonts w:ascii="Times New Roman" w:cs="Times New Roman" w:eastAsia="Times New Roman" w:hAnsi="Times New Roman"/>
+          <w:i/>
+          <w:iCs/>
+          <w:sz w:val="23"/>
+          <w:szCs w:val="23"/>
+        </w:rPr>
+        <w:t xml:space="preserve">Tu as maintenant le pourquoi, le problème, les remèdes, le banc, les chiffres et la preuve. Reste l'outil lui-même : comment s'en servir, concrètement, gestes par gestes.</w:t>
       </w:r>
     </w:p>
     <w:p>
@@ -2322,37 +2214,53 @@
           <w:sz w:val="32"/>
           <w:szCs w:val="32"/>
         </w:rPr>
-        <w:t xml:space="preserve">7. L'interface en cinq gestes</w:t>
-      </w:r>
-    </w:p>
-    <w:p>
-      <w:pPr>
-        <w:spacing w:after="120" w:before="0" w:line="360"/>
-        <w:jc w:val="both"/>
-      </w:pPr>
-      <w:r>
-        <w:rPr>
-          <w:rFonts w:ascii="Times New Roman" w:cs="Times New Roman" w:eastAsia="Times New Roman" w:hAnsi="Times New Roman"/>
-          <w:b w:val="false"/>
-          <w:bCs w:val="false"/>
-          <w:i w:val="false"/>
-          <w:iCs w:val="false"/>
-          <w:sz w:val="24"/>
-          <w:szCs w:val="24"/>
-        </w:rPr>
-        <w:t xml:space="preserve">Le tableau de bord s'ouvre dans un navigateur, quatre panneaux dans la barre du haut. Ce chapitre est un guide : </w:t>
-      </w:r>
-      <w:r>
-        <w:rPr>
-          <w:rFonts w:ascii="Times New Roman" w:cs="Times New Roman" w:eastAsia="Times New Roman" w:hAnsi="Times New Roman"/>
-          <w:b/>
-          <w:bCs/>
-          <w:i w:val="false"/>
-          <w:iCs w:val="false"/>
-          <w:sz w:val="24"/>
-          <w:szCs w:val="24"/>
-        </w:rPr>
-        <w:t xml:space="preserve">fais ceci, vois cela, comprends ceci</w:t>
+        <w:t xml:space="preserve">7. L'outil en cinq gestes</w:t>
+      </w:r>
+    </w:p>
+    <w:p>
+      <w:pPr>
+        <w:spacing w:after="160" w:line="340"/>
+        <w:ind w:left="454"/>
+      </w:pPr>
+      <w:r>
+        <w:rPr>
+          <w:rFonts w:ascii="Times New Roman" w:cs="Times New Roman" w:eastAsia="Times New Roman" w:hAnsi="Times New Roman"/>
+          <w:i/>
+          <w:iCs/>
+          <w:sz w:val="23"/>
+          <w:szCs w:val="23"/>
+        </w:rPr>
+        <w:t xml:space="preserve">Pourquoi cette section ? Parce que comprendre ne suffit pas : la soutenance peut demander une démonstration, et la DSI veut voir l'outil tourner.</w:t>
+      </w:r>
+    </w:p>
+    <w:p>
+      <w:pPr>
+        <w:spacing w:after="140" w:before="0" w:line="360"/>
+        <w:jc w:val="both"/>
+      </w:pPr>
+      <w:r>
+        <w:rPr>
+          <w:rFonts w:ascii="Times New Roman" w:cs="Times New Roman" w:eastAsia="Times New Roman" w:hAnsi="Times New Roman"/>
+          <w:b w:val="false"/>
+          <w:bCs w:val="false"/>
+          <w:i w:val="false"/>
+          <w:iCs w:val="false"/>
+          <w:sz w:val="24"/>
+          <w:szCs w:val="24"/>
+        </w:rPr>
+        <w:t xml:space="preserve">Le tableau de bord s'ouvre dans un navigateur (une page web servie par l'outil lui-même, pas de site distant). Quatre panneaux dans la barre du haut. Le parcours de ce guide suit l'ordre naturel d'une vraie session : </w:t>
+      </w:r>
+      <w:r>
+        <w:rPr>
+          <w:rFonts w:ascii="Times New Roman" w:cs="Times New Roman" w:eastAsia="Times New Roman" w:hAnsi="Times New Roman"/>
+          <w:b/>
+          <w:bCs/>
+          <w:i w:val="false"/>
+          <w:iCs w:val="false"/>
+          <w:sz w:val="24"/>
+          <w:szCs w:val="24"/>
+        </w:rPr>
+        <w:t xml:space="preserve">piloter, suivre, lire, prouver</w:t>
       </w:r>
       <w:r>
         <w:rPr>
@@ -2379,12 +2287,12 @@
           <w:sz w:val="26"/>
           <w:szCs w:val="26"/>
         </w:rPr>
-        <w:t xml:space="preserve">Geste 1 : t'orienter dans les quatre panneaux</w:t>
-      </w:r>
-    </w:p>
-    <w:p>
-      <w:pPr>
-        <w:spacing w:after="120" w:before="0" w:line="360"/>
+        <w:t xml:space="preserve">Geste 1 : t'orienter</w:t>
+      </w:r>
+    </w:p>
+    <w:p>
+      <w:pPr>
+        <w:spacing w:after="140" w:before="0" w:line="360"/>
         <w:ind w:firstLine="709"/>
         <w:jc w:val="both"/>
       </w:pPr>
@@ -2398,19 +2306,19 @@
           <w:sz w:val="24"/>
           <w:szCs w:val="24"/>
         </w:rPr>
-        <w:t xml:space="preserve">Campagne de mesure</w:t>
-      </w:r>
-      <w:r>
-        <w:rPr>
-          <w:rFonts w:ascii="Times New Roman" w:cs="Times New Roman" w:eastAsia="Times New Roman" w:hAnsi="Times New Roman"/>
-          <w:b w:val="false"/>
-          <w:bCs w:val="false"/>
-          <w:i w:val="false"/>
-          <w:iCs w:val="false"/>
-          <w:sz w:val="24"/>
-          <w:szCs w:val="24"/>
-        </w:rPr>
-        <w:t xml:space="preserve"> pilote : c'est la vue d'accueil. </w:t>
+        <w:t xml:space="preserve">Campagne</w:t>
+      </w:r>
+      <w:r>
+        <w:rPr>
+          <w:rFonts w:ascii="Times New Roman" w:cs="Times New Roman" w:eastAsia="Times New Roman" w:hAnsi="Times New Roman"/>
+          <w:b w:val="false"/>
+          <w:bCs w:val="false"/>
+          <w:i w:val="false"/>
+          <w:iCs w:val="false"/>
+          <w:sz w:val="24"/>
+          <w:szCs w:val="24"/>
+        </w:rPr>
+        <w:t xml:space="preserve"> prépare et pilote les essais : c'est la vue d'accueil. </w:t>
       </w:r>
       <w:r>
         <w:rPr>
@@ -2458,7 +2366,7 @@
           <w:sz w:val="24"/>
           <w:szCs w:val="24"/>
         </w:rPr>
-        <w:t xml:space="preserve"> classe les campagnes finies. </w:t>
+        <w:t xml:space="preserve"> classe les essais finis. </w:t>
       </w:r>
       <w:r>
         <w:rPr>
@@ -2482,26 +2390,7 @@
           <w:sz w:val="24"/>
           <w:szCs w:val="24"/>
         </w:rPr>
-        <w:t xml:space="preserve">, aussi appelée Intégrité, prouve que les archives n'ont pas bougé.</w:t>
-      </w:r>
-    </w:p>
-    <w:p>
-      <w:pPr>
-        <w:spacing w:after="120" w:before="0" w:line="360"/>
-        <w:ind w:firstLine="709"/>
-        <w:jc w:val="both"/>
-      </w:pPr>
-      <w:r>
-        <w:rPr>
-          <w:rFonts w:ascii="Times New Roman" w:cs="Times New Roman" w:eastAsia="Times New Roman" w:hAnsi="Times New Roman"/>
-          <w:b w:val="false"/>
-          <w:bCs w:val="false"/>
-          <w:i w:val="false"/>
-          <w:iCs w:val="false"/>
-          <w:sz w:val="24"/>
-          <w:szCs w:val="24"/>
-        </w:rPr>
-        <w:t xml:space="preserve">Retiens le parcours : piloter, suivre, lire, prouver. C'est aussi l'ordre de ce guide.</w:t>
+        <w:t xml:space="preserve"> (parfois appelée Intégrité) prouve que rien n'a bougé. Quand tu ne sais pas où regarder : demande-toi si tu pilotes, suis, lis ou prouves.</w:t>
       </w:r>
     </w:p>
     <w:p>
@@ -2512,7 +2401,7 @@
       <w:r>
         <w:drawing>
           <wp:inline distT="0" distB="0" distL="0" distR="0">
-            <wp:extent cx="3810000" cy="2143125"/>
+            <wp:extent cx="3390900" cy="1905000"/>
             <wp:effectExtent t="0" r="0" b="0" l="0"/>
             <wp:docPr id="1" name="" descr="" title=""/>
             <wp:cNvGraphicFramePr>
@@ -2537,7 +2426,7 @@
                   <pic:spPr bwMode="auto">
                     <a:xfrm>
                       <a:off x="0" y="0"/>
-                      <a:ext cx="3810000" cy="2143125"/>
+                      <a:ext cx="3390900" cy="1905000"/>
                     </a:xfrm>
                     <a:prstGeom prst="rect">
                       <a:avLst/>
@@ -2563,7 +2452,7 @@
           <w:sz w:val="22"/>
           <w:szCs w:val="22"/>
         </w:rPr>
-        <w:t xml:space="preserve">La vue Campagne : le cockpit trois cartes, l'audit du lien, le formulaire de campagne.</w:t>
+        <w:t xml:space="preserve">La vue Campagne : le cockpit en trois cartes, la carte d'audit, le formulaire de campagne.</w:t>
       </w:r>
     </w:p>
     <w:p>
@@ -2583,7 +2472,7 @@
     </w:p>
     <w:p>
       <w:pPr>
-        <w:spacing w:after="120" w:before="0" w:line="360"/>
+        <w:spacing w:after="140" w:before="0" w:line="360"/>
         <w:ind w:firstLine="709"/>
         <w:jc w:val="both"/>
       </w:pPr>
@@ -2597,7 +2486,7 @@
           <w:sz w:val="24"/>
           <w:szCs w:val="24"/>
         </w:rPr>
-        <w:t xml:space="preserve">Dans la vue Campagne, ouvre la carte </w:t>
+        <w:t xml:space="preserve">Vue Campagne, carte </w:t>
       </w:r>
       <w:r>
         <w:rPr>
@@ -2621,68 +2510,31 @@
           <w:sz w:val="24"/>
           <w:szCs w:val="24"/>
         </w:rPr>
-        <w:t xml:space="preserve"> et clique LANCER. Renseigne le site, le type de lien (fibre, 5g, 4g, vsat), la durée et la cible. L'audit mesure ton lien réel : latence au repos, latence sous charge courte, débit, perte.</w:t>
-      </w:r>
-    </w:p>
-    <w:p>
-      <w:pPr>
-        <w:spacing w:after="120" w:before="0" w:line="360"/>
-        <w:ind w:firstLine="709"/>
-        <w:jc w:val="both"/>
-      </w:pPr>
-      <w:r>
-        <w:rPr>
-          <w:rFonts w:ascii="Times New Roman" w:cs="Times New Roman" w:eastAsia="Times New Roman" w:hAnsi="Times New Roman"/>
-          <w:b w:val="false"/>
-          <w:bCs w:val="false"/>
-          <w:i w:val="false"/>
-          <w:iCs w:val="false"/>
-          <w:sz w:val="24"/>
-          <w:szCs w:val="24"/>
-        </w:rPr>
-        <w:t xml:space="preserve">Tu obtiens une ligne dans les archives : le profil réel de ton lien. </w:t>
-      </w:r>
-      <w:r>
-        <w:rPr>
-          <w:rFonts w:ascii="Times New Roman" w:cs="Times New Roman" w:eastAsia="Times New Roman" w:hAnsi="Times New Roman"/>
-          <w:b/>
-          <w:bCs/>
-          <w:i w:val="false"/>
-          <w:iCs w:val="false"/>
-          <w:sz w:val="24"/>
-          <w:szCs w:val="24"/>
-        </w:rPr>
-        <w:t xml:space="preserve">On ne façonne jamais un bord sans avoir mesuré ce que le lien fait à vide</w:t>
-      </w:r>
-      <w:r>
-        <w:rPr>
-          <w:rFonts w:ascii="Times New Roman" w:cs="Times New Roman" w:eastAsia="Times New Roman" w:hAnsi="Times New Roman"/>
-          <w:b w:val="false"/>
-          <w:bCs w:val="false"/>
-          <w:i w:val="false"/>
-          <w:iCs w:val="false"/>
-          <w:sz w:val="24"/>
-          <w:szCs w:val="24"/>
-        </w:rPr>
-        <w:t xml:space="preserve"> : l'audit est le point d'entrée de toute la démarche, et il fonctionne même depuis un poste Windows.</w:t>
-      </w:r>
-    </w:p>
-    <w:p>
-      <w:pPr>
-        <w:pBdr>
-          <w:left w:val="single" w:color="9DB4CE" w:sz="6"/>
-        </w:pBdr>
-        <w:spacing w:after="160" w:before="80" w:line="340"/>
-        <w:ind w:left="850" w:right="454"/>
-        <w:jc w:val="both"/>
-      </w:pPr>
-      <w:r>
-        <w:rPr>
-          <w:rFonts w:ascii="Times New Roman" w:cs="Times New Roman" w:eastAsia="Times New Roman" w:hAnsi="Times New Roman"/>
-          <w:sz w:val="23"/>
-          <w:szCs w:val="23"/>
-        </w:rPr>
-        <w:t xml:space="preserve">Dans le terminal, l'équivalent : cgo audit --link-type 4g --site "Site X" --duration 30. Le résultat rejoint data/link_audit.csv.</w:t>
+        <w:t xml:space="preserve"> : clique LANCER, renseigne le site, le type de lien (fibre, 4g, vsat...), la durée, la cible. L'outil mesure ton lien réel, en douceur : latence au repos, latence pendant une courte charge, débit, perte. </w:t>
+      </w:r>
+      <w:r>
+        <w:rPr>
+          <w:rFonts w:ascii="Times New Roman" w:cs="Times New Roman" w:eastAsia="Times New Roman" w:hAnsi="Times New Roman"/>
+          <w:b/>
+          <w:bCs/>
+          <w:i w:val="false"/>
+          <w:iCs w:val="false"/>
+          <w:sz w:val="24"/>
+          <w:szCs w:val="24"/>
+        </w:rPr>
+        <w:t xml:space="preserve">Règle d'or : on ne configure jamais un routeur sans avoir mesuré le lien à vide d'abord</w:t>
+      </w:r>
+      <w:r>
+        <w:rPr>
+          <w:rFonts w:ascii="Times New Roman" w:cs="Times New Roman" w:eastAsia="Times New Roman" w:hAnsi="Times New Roman"/>
+          <w:b w:val="false"/>
+          <w:bCs w:val="false"/>
+          <w:i w:val="false"/>
+          <w:iCs w:val="false"/>
+          <w:sz w:val="24"/>
+          <w:szCs w:val="24"/>
+        </w:rPr>
+        <w:t xml:space="preserve">. Terminal : cgo audit --link-type 4g --site "Site X" --duration 30.</w:t>
       </w:r>
     </w:p>
     <w:p>
@@ -2702,7 +2554,7 @@
     </w:p>
     <w:p>
       <w:pPr>
-        <w:spacing w:after="120" w:before="0" w:line="360"/>
+        <w:spacing w:after="140" w:before="0" w:line="360"/>
         <w:ind w:firstLine="709"/>
         <w:jc w:val="both"/>
       </w:pPr>
@@ -2716,36 +2568,36 @@
           <w:sz w:val="24"/>
           <w:szCs w:val="24"/>
         </w:rPr>
-        <w:t xml:space="preserve">Toujours dans la vue Campagne : coche un profil (P2 pour retrouver les chiffres de ce guide), choisis les répétitions et l'échéance. Le démarrage se fait </w:t>
-      </w:r>
-      <w:r>
-        <w:rPr>
-          <w:rFonts w:ascii="Times New Roman" w:cs="Times New Roman" w:eastAsia="Times New Roman" w:hAnsi="Times New Roman"/>
-          <w:b/>
-          <w:bCs/>
-          <w:i w:val="false"/>
-          <w:iCs w:val="false"/>
-          <w:sz w:val="24"/>
-          <w:szCs w:val="24"/>
-        </w:rPr>
-        <w:t xml:space="preserve">en deux confirmations</w:t>
-      </w:r>
-      <w:r>
-        <w:rPr>
-          <w:rFonts w:ascii="Times New Roman" w:cs="Times New Roman" w:eastAsia="Times New Roman" w:hAnsi="Times New Roman"/>
-          <w:b w:val="false"/>
-          <w:bCs w:val="false"/>
-          <w:i w:val="false"/>
-          <w:iCs w:val="false"/>
-          <w:sz w:val="24"/>
-          <w:szCs w:val="24"/>
-        </w:rPr>
-        <w:t xml:space="preserve"> : la campagne engage le poste plusieurs dizaines de minutes, rien ne démarre par un clic accidentel.</w:t>
-      </w:r>
-    </w:p>
-    <w:p>
-      <w:pPr>
-        <w:spacing w:after="120" w:before="0" w:line="360"/>
+        <w:t xml:space="preserve">Vue Campagne : coche P2, choisis les répétitions et l'échéance, puis </w:t>
+      </w:r>
+      <w:r>
+        <w:rPr>
+          <w:rFonts w:ascii="Times New Roman" w:cs="Times New Roman" w:eastAsia="Times New Roman" w:hAnsi="Times New Roman"/>
+          <w:b/>
+          <w:bCs/>
+          <w:i w:val="false"/>
+          <w:iCs w:val="false"/>
+          <w:sz w:val="24"/>
+          <w:szCs w:val="24"/>
+        </w:rPr>
+        <w:t xml:space="preserve">deux confirmations</w:t>
+      </w:r>
+      <w:r>
+        <w:rPr>
+          <w:rFonts w:ascii="Times New Roman" w:cs="Times New Roman" w:eastAsia="Times New Roman" w:hAnsi="Times New Roman"/>
+          <w:b w:val="false"/>
+          <w:bCs w:val="false"/>
+          <w:i w:val="false"/>
+          <w:iCs w:val="false"/>
+          <w:sz w:val="24"/>
+          <w:szCs w:val="24"/>
+        </w:rPr>
+        <w:t xml:space="preserve"> (la campagne occupe le poste des dizaines de minutes : rien ne démarre par un clic raté).</w:t>
+      </w:r>
+    </w:p>
+    <w:p>
+      <w:pPr>
+        <w:spacing w:after="140" w:before="0" w:line="360"/>
         <w:ind w:firstLine="709"/>
         <w:jc w:val="both"/>
       </w:pPr>
@@ -2759,7 +2611,7 @@
           <w:sz w:val="24"/>
           <w:szCs w:val="24"/>
         </w:rPr>
-        <w:t xml:space="preserve">Passe au </w:t>
+        <w:t xml:space="preserve">Bascule sur </w:t>
       </w:r>
       <w:r>
         <w:rPr>
@@ -2783,7 +2635,31 @@
           <w:sz w:val="24"/>
           <w:szCs w:val="24"/>
         </w:rPr>
-        <w:t xml:space="preserve"> pour suivre : cartes de latence et de débit, mur de comparaison entre la référence et la configuration testée, journal des événements. La divergence entre les deux côtés du mur, c'est ton résultat en train de naître.</w:t>
+        <w:t xml:space="preserve"> : cartes de latence et de débit, et le mur de comparaison (la référence d'un côté, la configuration testée de l'autre, la même échelle). </w:t>
+      </w:r>
+      <w:r>
+        <w:rPr>
+          <w:rFonts w:ascii="Times New Roman" w:cs="Times New Roman" w:eastAsia="Times New Roman" w:hAnsi="Times New Roman"/>
+          <w:b/>
+          <w:bCs/>
+          <w:i w:val="false"/>
+          <w:iCs w:val="false"/>
+          <w:sz w:val="24"/>
+          <w:szCs w:val="24"/>
+        </w:rPr>
+        <w:t xml:space="preserve">L'écart entre les deux côtés du mur, c'est ton résultat en train de naître</w:t>
+      </w:r>
+      <w:r>
+        <w:rPr>
+          <w:rFonts w:ascii="Times New Roman" w:cs="Times New Roman" w:eastAsia="Times New Roman" w:hAnsi="Times New Roman"/>
+          <w:b w:val="false"/>
+          <w:bCs w:val="false"/>
+          <w:i w:val="false"/>
+          <w:iCs w:val="false"/>
+          <w:sz w:val="24"/>
+          <w:szCs w:val="24"/>
+        </w:rPr>
+        <w:t xml:space="preserve">. Terminal : cgo run --profiles P2 --reps 1. Coupure de courant ? Relance la même commande : la campagne reprend où elle s'était arrêtée.</w:t>
       </w:r>
     </w:p>
     <w:p>
@@ -2794,7 +2670,7 @@
       <w:r>
         <w:drawing>
           <wp:inline distT="0" distB="0" distL="0" distR="0">
-            <wp:extent cx="3810000" cy="2143125"/>
+            <wp:extent cx="3390900" cy="1905000"/>
             <wp:effectExtent t="0" r="0" b="0" l="0"/>
             <wp:docPr id="1" name="" descr="" title=""/>
             <wp:cNvGraphicFramePr>
@@ -2819,7 +2695,7 @@
                   <pic:spPr bwMode="auto">
                     <a:xfrm>
                       <a:off x="0" y="0"/>
-                      <a:ext cx="3810000" cy="2143125"/>
+                      <a:ext cx="3390900" cy="1905000"/>
                     </a:xfrm>
                     <a:prstGeom prst="rect">
                       <a:avLst/>
@@ -2845,25 +2721,7 @@
           <w:sz w:val="22"/>
           <w:szCs w:val="22"/>
         </w:rPr>
-        <w:t xml:space="preserve">Le tableau live pendant une campagne : cartes, mur de comparaison, progression de l'événement courant.</w:t>
-      </w:r>
-    </w:p>
-    <w:p>
-      <w:pPr>
-        <w:pBdr>
-          <w:left w:val="single" w:color="9DB4CE" w:sz="6"/>
-        </w:pBdr>
-        <w:spacing w:after="160" w:before="80" w:line="340"/>
-        <w:ind w:left="850" w:right="454"/>
-        <w:jc w:val="both"/>
-      </w:pPr>
-      <w:r>
-        <w:rPr>
-          <w:rFonts w:ascii="Times New Roman" w:cs="Times New Roman" w:eastAsia="Times New Roman" w:hAnsi="Times New Roman"/>
-          <w:sz w:val="23"/>
-          <w:szCs w:val="23"/>
-        </w:rPr>
-        <w:t xml:space="preserve">Dans le terminal : cgo run --profiles P2 --reps 1. En cas de coupure de courant, relance la même commande : la campagne reprend où elle s'était arrêtée, sans perdre une ligne déjà gelée.</w:t>
+        <w:t xml:space="preserve">Le tableau live : cartes, mur de comparaison, progression de l'essai courant.</w:t>
       </w:r>
     </w:p>
     <w:p>
@@ -2883,7 +2741,7 @@
     </w:p>
     <w:p>
       <w:pPr>
-        <w:spacing w:after="120" w:before="0" w:line="360"/>
+        <w:spacing w:after="140" w:before="0" w:line="360"/>
         <w:ind w:firstLine="709"/>
         <w:jc w:val="both"/>
       </w:pPr>
@@ -2897,7 +2755,7 @@
           <w:sz w:val="24"/>
           <w:szCs w:val="24"/>
         </w:rPr>
-        <w:t xml:space="preserve">La vue </w:t>
+        <w:t xml:space="preserve">Vue </w:t>
       </w:r>
       <w:r>
         <w:rPr>
@@ -2921,7 +2779,7 @@
           <w:sz w:val="24"/>
           <w:szCs w:val="24"/>
         </w:rPr>
-        <w:t xml:space="preserve"> classe les cellules par critère : échéance, latence, régularité, débit ou coût. Épingle une cellule A, une cellule B : la comparaison s'affiche, avec un </w:t>
+        <w:t xml:space="preserve"> : le classement des cellules (une cellule = une combinaison profil + discipline + émetteur). Épingle une cellule A, une cellule B : la comparaison affiche un </w:t>
       </w:r>
       <w:r>
         <w:rPr>
@@ -2945,12 +2803,12 @@
           <w:sz w:val="24"/>
           <w:szCs w:val="24"/>
         </w:rPr>
-        <w:t xml:space="preserve"> calculé depuis les valeurs, et une prescription de configuration prête à copier.</w:t>
-      </w:r>
-    </w:p>
-    <w:p>
-      <w:pPr>
-        <w:spacing w:after="120" w:before="0" w:line="360"/>
+        <w:t xml:space="preserve"> calculé depuis les valeurs, avec une prescription de configuration (le réglage recommandé, prêt à copier).</w:t>
+      </w:r>
+    </w:p>
+    <w:p>
+      <w:pPr>
+        <w:spacing w:after="140" w:before="0" w:line="360"/>
         <w:ind w:firstLine="709"/>
         <w:jc w:val="both"/>
       </w:pPr>
@@ -2964,7 +2822,7 @@
           <w:sz w:val="24"/>
           <w:szCs w:val="24"/>
         </w:rPr>
-        <w:t xml:space="preserve">Le verdict ne dit pas « la cellule 4 est meilleure ». Il dit : </w:t>
+        <w:t xml:space="preserve">Le verdict ne dit pas « la cellule 4 gagne ». Il dit : </w:t>
       </w:r>
       <w:r>
         <w:rPr>
@@ -2976,7 +2834,7 @@
           <w:sz w:val="24"/>
           <w:szCs w:val="24"/>
         </w:rPr>
-        <w:t xml:space="preserve">« échéance tenue à 98 %, régularité maintenue, débit préservé, coût de 356 ariary par heure ; recommandation : CAKE calé sous la capacité mesurée »</w:t>
+        <w:t xml:space="preserve">« échéance tenue à 98 %, régularité maintenue, débit préservé, coût 356 ariary par heure ; recommandation : CAKE calé sous la capacité mesurée »</w:t>
       </w:r>
       <w:r>
         <w:rPr>
@@ -2999,7 +2857,7 @@
       <w:r>
         <w:drawing>
           <wp:inline distT="0" distB="0" distL="0" distR="0">
-            <wp:extent cx="3810000" cy="2143125"/>
+            <wp:extent cx="3390900" cy="1905000"/>
             <wp:effectExtent t="0" r="0" b="0" l="0"/>
             <wp:docPr id="1" name="" descr="" title=""/>
             <wp:cNvGraphicFramePr>
@@ -3024,7 +2882,7 @@
                   <pic:spPr bwMode="auto">
                     <a:xfrm>
                       <a:off x="0" y="0"/>
-                      <a:ext cx="3810000" cy="2143125"/>
+                      <a:ext cx="3390900" cy="1905000"/>
                     </a:xfrm>
                     <a:prstGeom prst="rect">
                       <a:avLst/>
@@ -3070,7 +2928,7 @@
     </w:p>
     <w:p>
       <w:pPr>
-        <w:spacing w:after="120" w:before="0" w:line="360"/>
+        <w:spacing w:after="140" w:before="0" w:line="360"/>
         <w:ind w:firstLine="709"/>
         <w:jc w:val="both"/>
       </w:pPr>
@@ -3084,7 +2942,7 @@
           <w:sz w:val="24"/>
           <w:szCs w:val="24"/>
         </w:rPr>
-        <w:t xml:space="preserve">La vue </w:t>
+        <w:t xml:space="preserve">Vue </w:t>
       </w:r>
       <w:r>
         <w:rPr>
@@ -3108,7 +2966,7 @@
           <w:sz w:val="24"/>
           <w:szCs w:val="24"/>
         </w:rPr>
-        <w:t xml:space="preserve"> affiche les comptes : 134 campagnes archivées, 83 lignes valides, 154 en quarantaine, et l'empreinte SHA-256 du dernier gel. Le bouton </w:t>
+        <w:t xml:space="preserve"> : les comptes (134 campagnes, 83 lignes valides, 154 en quarantaine) et l'empreinte du dernier gel. Le bouton </w:t>
       </w:r>
       <w:r>
         <w:rPr>
@@ -3132,26 +2990,7 @@
           <w:sz w:val="24"/>
           <w:szCs w:val="24"/>
         </w:rPr>
-        <w:t xml:space="preserve"> recalcule les empreintes : tout écart s'afficherait immédiatement.</w:t>
-      </w:r>
-    </w:p>
-    <w:p>
-      <w:pPr>
-        <w:spacing w:after="120" w:before="0" w:line="360"/>
-        <w:ind w:firstLine="709"/>
-        <w:jc w:val="both"/>
-      </w:pPr>
-      <w:r>
-        <w:rPr>
-          <w:rFonts w:ascii="Times New Roman" w:cs="Times New Roman" w:eastAsia="Times New Roman" w:hAnsi="Times New Roman"/>
-          <w:b w:val="false"/>
-          <w:bCs w:val="false"/>
-          <w:i w:val="false"/>
-          <w:iCs w:val="false"/>
-          <w:sz w:val="24"/>
-          <w:szCs w:val="24"/>
-        </w:rPr>
-        <w:t xml:space="preserve">Le lien </w:t>
+        <w:t xml:space="preserve"> recalcule les empreintes sur place. Le lien </w:t>
       </w:r>
       <w:r>
         <w:rPr>
@@ -3175,7 +3014,7 @@
           <w:sz w:val="24"/>
           <w:szCs w:val="24"/>
         </w:rPr>
-        <w:t xml:space="preserve"> télécharge le constat complet : la synthèse de la campagne, prête à joindre à un courriel de direction.</w:t>
+        <w:t xml:space="preserve"> télécharge le constat complet, prêt à joindre à un courriel de direction. Terminal : cgo verify, cgo figures, cgo kit backup (le kit compte dix-huit commandes, de doctor à backup).</w:t>
       </w:r>
     </w:p>
     <w:p>
@@ -3186,7 +3025,7 @@
       <w:r>
         <w:drawing>
           <wp:inline distT="0" distB="0" distL="0" distR="0">
-            <wp:extent cx="3810000" cy="2143125"/>
+            <wp:extent cx="3390900" cy="1905000"/>
             <wp:effectExtent t="0" r="0" b="0" l="0"/>
             <wp:docPr id="1" name="" descr="" title=""/>
             <wp:cNvGraphicFramePr>
@@ -3211,7 +3050,7 @@
                   <pic:spPr bwMode="auto">
                     <a:xfrm>
                       <a:off x="0" y="0"/>
-                      <a:ext cx="3810000" cy="2143125"/>
+                      <a:ext cx="3390900" cy="1905000"/>
                     </a:xfrm>
                     <a:prstGeom prst="rect">
                       <a:avLst/>
@@ -3243,28 +3082,10 @@
     <w:p>
       <w:pPr>
         <w:pBdr>
-          <w:left w:val="single" w:color="9DB4CE" w:sz="6"/>
-        </w:pBdr>
-        <w:spacing w:after="160" w:before="80" w:line="340"/>
-        <w:ind w:left="850" w:right="454"/>
-        <w:jc w:val="both"/>
-      </w:pPr>
-      <w:r>
-        <w:rPr>
-          <w:rFonts w:ascii="Times New Roman" w:cs="Times New Roman" w:eastAsia="Times New Roman" w:hAnsi="Times New Roman"/>
-          <w:sz w:val="23"/>
-          <w:szCs w:val="23"/>
-        </w:rPr>
-        <w:t xml:space="preserve">Dans le terminal : cgo verify recalcule toutes les empreintes, cgo figures régénère les graphiques depuis le gel, cgo kit backup rapatrie les archives. Le kit complet compte dix-huit actions, de doctor à backup.</w:t>
-      </w:r>
-    </w:p>
-    <w:p>
-      <w:pPr>
-        <w:pBdr>
           <w:top w:val="single" w:color="808080" w:sz="4"/>
           <w:bottom w:val="single" w:color="808080" w:sz="4"/>
         </w:pBdr>
-        <w:spacing w:after="240" w:before="200" w:line="340"/>
+        <w:spacing w:after="260" w:before="220" w:line="340"/>
         <w:ind w:left="454" w:right="454"/>
       </w:pPr>
       <w:r>
@@ -3287,7 +3108,7 @@
           <w:sz w:val="23"/>
           <w:szCs w:val="23"/>
         </w:rPr>
-        <w:t xml:space="preserve">Écris la chaîne de confiance en quatre mots reliés par des flèches : mesure, gel, empreinte, vérification. Elle tient en une ligne de crayon et c'est la colonne vertébrale de tout le mémoire.</w:t>
+        <w:t xml:space="preserve">Écris les quatre panneaux et leur verbe : Campagne pilote, Live suit, Résultats lit, Provenance prouve. Quatre mots, un chacun.</w:t>
       </w:r>
     </w:p>
     <w:p>
@@ -3307,20 +3128,20 @@
     </w:p>
     <w:p>
       <w:pPr>
-        <w:spacing w:after="120" w:before="0" w:line="360"/>
-        <w:jc w:val="both"/>
-      </w:pPr>
-      <w:r>
-        <w:rPr>
-          <w:rFonts w:ascii="Times New Roman" w:cs="Times New Roman" w:eastAsia="Times New Roman" w:hAnsi="Times New Roman"/>
-          <w:b w:val="false"/>
-          <w:bCs w:val="false"/>
-          <w:i w:val="false"/>
-          <w:iCs w:val="false"/>
-          <w:sz w:val="24"/>
-          <w:szCs w:val="24"/>
-        </w:rPr>
-        <w:t xml:space="preserve">Si tu ne retiens que cinq nombres, que ce soient ceux-là. Chacun porte sa question probable : c'est ainsi qu'ils se révèlent utiles.</w:t>
+        <w:spacing w:after="140" w:before="0" w:line="360"/>
+        <w:jc w:val="both"/>
+      </w:pPr>
+      <w:r>
+        <w:rPr>
+          <w:rFonts w:ascii="Times New Roman" w:cs="Times New Roman" w:eastAsia="Times New Roman" w:hAnsi="Times New Roman"/>
+          <w:b w:val="false"/>
+          <w:bCs w:val="false"/>
+          <w:i w:val="false"/>
+          <w:iCs w:val="false"/>
+          <w:sz w:val="24"/>
+          <w:szCs w:val="24"/>
+        </w:rPr>
+        <w:t xml:space="preserve">Si tu ne retiens que cinq nombres, que ce soient ceux-là. Chacun arrive avec la question qu'on te posera.</w:t>
       </w:r>
     </w:p>
     <w:p>
@@ -3328,7 +3149,7 @@
         <w:pBdr>
           <w:left w:val="single" w:color="9DB4CE" w:sz="6"/>
         </w:pBdr>
-        <w:spacing w:after="160" w:before="80" w:line="340"/>
+        <w:spacing w:after="180" w:before="80" w:line="340"/>
         <w:ind w:left="850" w:right="454"/>
         <w:jc w:val="both"/>
       </w:pPr>
@@ -3338,7 +3159,7 @@
           <w:sz w:val="23"/>
           <w:szCs w:val="23"/>
         </w:rPr>
-        <w:t xml:space="preserve">60 % contre 98 % : la file simple contre CAKE, requêtes critiques à l'heure sous charge, profil 4G. Question : « Où est le gain ? » Réponse : dans la latence sauvée, à débit égal.</w:t>
+        <w:t xml:space="preserve">60 % contre 98 % : la file simple contre CAKE, petites requêtes à l'heure sous charge, profil 4G. Question attendue : « où est le gain ? » Réponse : dans la latence sauvée, à débit égal.</w:t>
       </w:r>
     </w:p>
     <w:p>
@@ -3346,7 +3167,7 @@
         <w:pBdr>
           <w:left w:val="single" w:color="9DB4CE" w:sz="6"/>
         </w:pBdr>
-        <w:spacing w:after="160" w:before="80" w:line="340"/>
+        <w:spacing w:after="180" w:before="80" w:line="340"/>
         <w:ind w:left="850" w:right="454"/>
         <w:jc w:val="both"/>
       </w:pPr>
@@ -3356,7 +3177,7 @@
           <w:sz w:val="23"/>
           <w:szCs w:val="23"/>
         </w:rPr>
-        <w:t xml:space="preserve">57 millisecondes vers 13 : l'écart de régularité, QDI, entre file simple et discipline active. Question : « Pourquoi pas juste la latence ? » Réponse : parce qu'un lien régulier, c'est un lien que l'on peut surveiller avec des seuils.</w:t>
+        <w:t xml:space="preserve">57 millisecondes vers 13 : l'écart de régularité (QDI) entre file simple et discipline active. Question : « pourquoi pas juste la latence ? » Réponse : un lien régulier est un lien qu'on peut surveiller avec des seuils.</w:t>
       </w:r>
     </w:p>
     <w:p>
@@ -3364,7 +3185,7 @@
         <w:pBdr>
           <w:left w:val="single" w:color="9DB4CE" w:sz="6"/>
         </w:pBdr>
-        <w:spacing w:after="160" w:before="80" w:line="340"/>
+        <w:spacing w:after="180" w:before="80" w:line="340"/>
         <w:ind w:left="850" w:right="454"/>
         <w:jc w:val="both"/>
       </w:pPr>
@@ -3374,7 +3195,7 @@
           <w:sz w:val="23"/>
           <w:szCs w:val="23"/>
         </w:rPr>
-        <w:t xml:space="preserve">25 000 ariary = 4,5 gigaoctets, soit 5 556 ariary le gigaoctet, le plus mauvais rapport du catalogue. Question : « D'où sortent vos tarifs ? » Réponse : des grilles publiques des opérateurs de 2026, le journalier étant cinq fois moins cher au gigaoctet.</w:t>
+        <w:t xml:space="preserve">25 000 ariary = 4,5 gigaoctets, soit 5 556 ariary le gigaoctet : le plus mauvais rapport du catalogue, le journalier étant cinq fois moins cher. Question : « d'où sortent vos tarifs ? » Réponse : des grilles publiques des opérateurs de 2026.</w:t>
       </w:r>
     </w:p>
     <w:p>
@@ -3382,7 +3203,7 @@
         <w:pBdr>
           <w:left w:val="single" w:color="9DB4CE" w:sz="6"/>
         </w:pBdr>
-        <w:spacing w:after="160" w:before="80" w:line="340"/>
+        <w:spacing w:after="180" w:before="80" w:line="340"/>
         <w:ind w:left="850" w:right="454"/>
         <w:jc w:val="both"/>
       </w:pPr>
@@ -3392,7 +3213,7 @@
           <w:sz w:val="23"/>
           <w:szCs w:val="23"/>
         </w:rPr>
-        <w:t xml:space="preserve">220 millisecondes : l'échéance du profil 4G, calée sur la médiane du profil, cent millisecondes, plus une marge de file. Question : « Pourquoi ce seuil ? » Réponse : parce qu'il se situe là où les disciplines se séparent franchement.</w:t>
+        <w:t xml:space="preserve">220 millisecondes : l'échéance du profil 4G, calée sur le cas médian (100 ms) plus la marge de file. Question : « pourquoi ce seuil ? » Réponse : c'est là que les disciplines se séparent franchement.</w:t>
       </w:r>
     </w:p>
     <w:p>
@@ -3400,7 +3221,7 @@
         <w:pBdr>
           <w:left w:val="single" w:color="9DB4CE" w:sz="6"/>
         </w:pBdr>
-        <w:spacing w:after="160" w:before="80" w:line="340"/>
+        <w:spacing w:after="180" w:before="80" w:line="340"/>
         <w:ind w:left="850" w:right="454"/>
         <w:jc w:val="both"/>
       </w:pPr>
@@ -3410,7 +3231,7 @@
           <w:sz w:val="23"/>
           <w:szCs w:val="23"/>
         </w:rPr>
-        <w:t xml:space="preserve">134 campagnes, 286 lignes, 83 valides, 154 en quarantaine, chaque fichier scellé par SHA-256. Question : « Vos chiffres sont-ils vérifiables ? » Réponse : oui, chaque figure se régénère depuis le gel, et cgo verify recalcule tout.</w:t>
+        <w:t xml:space="preserve">134 campagnes, 286 lignes, 83 valides, 154 en quarantaine, le tout scellé par SHA-256. Question : « vos chiffres sont-ils vérifiables ? » Réponse : chaque figure se régénère depuis le gel, cgo verify recalcule tout.</w:t>
       </w:r>
     </w:p>
     <w:p>
@@ -3430,7 +3251,7 @@
     </w:p>
     <w:p>
       <w:pPr>
-        <w:spacing w:after="120" w:before="0" w:line="360"/>
+        <w:spacing w:after="140" w:before="0" w:line="360"/>
         <w:ind w:firstLine="709"/>
         <w:jc w:val="both"/>
       </w:pPr>
@@ -3444,50 +3265,31 @@
           <w:sz w:val="24"/>
           <w:szCs w:val="24"/>
         </w:rPr>
-        <w:t xml:space="preserve">Tu as le contexte, le problème, les remèdes, le banc, les chiffres et la preuve : </w:t>
-      </w:r>
-      <w:r>
-        <w:rPr>
-          <w:rFonts w:ascii="Times New Roman" w:cs="Times New Roman" w:eastAsia="Times New Roman" w:hAnsi="Times New Roman"/>
-          <w:b/>
-          <w:bCs/>
-          <w:i w:val="false"/>
-          <w:iCs w:val="false"/>
-          <w:sz w:val="24"/>
-          <w:szCs w:val="24"/>
-        </w:rPr>
-        <w:t xml:space="preserve">le mémoire tient dans ta tête</w:t>
-      </w:r>
-      <w:r>
-        <w:rPr>
-          <w:rFonts w:ascii="Times New Roman" w:cs="Times New Roman" w:eastAsia="Times New Roman" w:hAnsi="Times New Roman"/>
-          <w:b w:val="false"/>
-          <w:bCs w:val="false"/>
-          <w:i w:val="false"/>
-          <w:iCs w:val="false"/>
-          <w:sz w:val="24"/>
-          <w:szCs w:val="24"/>
-        </w:rPr>
-        <w:t xml:space="preserve">. Trois suites possibles, dans l'ordre de l'effort.</w:t>
-      </w:r>
-    </w:p>
-    <w:p>
-      <w:pPr>
-        <w:spacing w:after="120" w:before="0" w:line="360"/>
-        <w:ind w:firstLine="709"/>
-        <w:jc w:val="both"/>
-      </w:pPr>
-      <w:r>
-        <w:rPr>
-          <w:rFonts w:ascii="Times New Roman" w:cs="Times New Roman" w:eastAsia="Times New Roman" w:hAnsi="Times New Roman"/>
-          <w:b w:val="false"/>
-          <w:bCs w:val="false"/>
-          <w:i w:val="false"/>
-          <w:iCs w:val="false"/>
-          <w:sz w:val="24"/>
-          <w:szCs w:val="24"/>
-        </w:rPr>
-        <w:t xml:space="preserve">Pour préparer ton oral : le document d'explication complet, avec la rhétorique de soutenance et le kit de questions-réponses armées. Pour creuser un point : la thèse, chaque affirmation y est développée avec ses chiffres. Pour t'en servir : le tableau de bord, les cinq gestes de ce guide, et le terminal avec ses dix-huit commandes kit.</w:t>
+        <w:t xml:space="preserve">Tu as le terrain, le problème, les remèdes, le banc, les chiffres et la preuve : </w:t>
+      </w:r>
+      <w:r>
+        <w:rPr>
+          <w:rFonts w:ascii="Times New Roman" w:cs="Times New Roman" w:eastAsia="Times New Roman" w:hAnsi="Times New Roman"/>
+          <w:b/>
+          <w:bCs/>
+          <w:i w:val="false"/>
+          <w:iCs w:val="false"/>
+          <w:sz w:val="24"/>
+          <w:szCs w:val="24"/>
+        </w:rPr>
+        <w:t xml:space="preserve">le mémoire tient maintenant dans ta tête</w:t>
+      </w:r>
+      <w:r>
+        <w:rPr>
+          <w:rFonts w:ascii="Times New Roman" w:cs="Times New Roman" w:eastAsia="Times New Roman" w:hAnsi="Times New Roman"/>
+          <w:b w:val="false"/>
+          <w:bCs w:val="false"/>
+          <w:i w:val="false"/>
+          <w:iCs w:val="false"/>
+          <w:sz w:val="24"/>
+          <w:szCs w:val="24"/>
+        </w:rPr>
+        <w:t xml:space="preserve">. Trois suites, par ordre d'effort : le document d'explication complet (il prépare ton oral, avec le kit de questions-réponses armées) ; la thèse (chaque affirmation, développée avec ses chiffres) ; et l'outil lui-même, avec ses cinq gestes et ses dix-huit commandes.</w:t>
       </w:r>
     </w:p>
     <w:p>
@@ -3506,7 +3308,7 @@
           <w:sz w:val="24"/>
           <w:szCs w:val="24"/>
         </w:rPr>
-        <w:t xml:space="preserve">Une seule chose à ne jamais oublier : </w:t>
+        <w:t xml:space="preserve">Une seule phrase à ne jamais perdre : </w:t>
       </w:r>
       <w:r>
         <w:rPr>

</xml_diff>